<commit_message>
Update resume and remove backup copies
</commit_message>
<xml_diff>
--- a/resume.docx
+++ b/resume.docx
@@ -1,182 +1,25 @@
 
 <file path=word/document.xml><?xml version="1.0" encoding="utf-8"?>
-<w:document xmlns:wpc="http://schemas.microsoft.com/office/word/2010/wordprocessingCanvas" xmlns:cx="http://schemas.microsoft.com/office/drawing/2014/chartex" xmlns:cx1="http://schemas.microsoft.com/office/drawing/2015/9/8/chartex" xmlns:cx2="http://schemas.microsoft.com/office/drawing/2015/10/21/chartex" xmlns:cx3="http://schemas.microsoft.com/office/drawing/2016/5/9/chartex" xmlns:cx4="http://schemas.microsoft.com/office/drawing/2016/5/10/chartex" xmlns:cx5="http://schemas.microsoft.com/office/drawing/2016/5/11/chartex" xmlns:cx6="http://schemas.microsoft.com/office/drawing/2016/5/12/chartex" xmlns:cx7="http://schemas.microsoft.com/office/drawing/2016/5/13/chartex" xmlns:cx8="http://schemas.microsoft.com/office/drawing/2016/5/14/chartex" xmlns:mc="http://schemas.openxmlformats.org/markup-compatibility/2006" xmlns:aink="http://schemas.microsoft.com/office/drawing/2016/ink" xmlns:am3d="http://schemas.microsoft.com/office/drawing/2017/model3d" xmlns:o="urn:schemas-microsoft-com:office:office" xmlns:r="http://schemas.openxmlformats.org/officeDocument/2006/relationships" xmlns:m="http://schemas.openxmlformats.org/officeDocument/2006/math" xmlns:v="urn:schemas-microsoft-com:vml" xmlns:wp14="http://schemas.microsoft.com/office/word/2010/wordprocessingDrawing" xmlns:wp="http://schemas.openxmlformats.org/drawingml/2006/wordprocessingDrawing" xmlns:w10="urn:schemas-microsoft-com:office:word" xmlns:w="http://schemas.openxmlformats.org/wordprocessingml/2006/main" xmlns:w14="http://schemas.microsoft.com/office/word/2010/wordml" xmlns:w15="http://schemas.microsoft.com/office/word/2012/wordml" xmlns:w16cex="http://schemas.microsoft.com/office/word/2018/wordml/cex" xmlns:w16cid="http://schemas.microsoft.com/office/word/2016/wordml/cid" xmlns:w16="http://schemas.microsoft.com/office/word/2018/wordml" xmlns:w16se="http://schemas.microsoft.com/office/word/2015/wordml/symex" xmlns:wpg="http://schemas.microsoft.com/office/word/2010/wordprocessingGroup" xmlns:wpi="http://schemas.microsoft.com/office/word/2010/wordprocessingInk" xmlns:wne="http://schemas.microsoft.com/office/word/2006/wordml" xmlns:wps="http://schemas.microsoft.com/office/word/2010/wordprocessingShape" mc:Ignorable="w14 w15 w16se w16cid w16 w16cex wp14">
+<w:document xmlns:wpc="http://schemas.microsoft.com/office/word/2010/wordprocessingCanvas" xmlns:cx="http://schemas.microsoft.com/office/drawing/2014/chartex" xmlns:cx1="http://schemas.microsoft.com/office/drawing/2015/9/8/chartex" xmlns:cx2="http://schemas.microsoft.com/office/drawing/2015/10/21/chartex" xmlns:cx3="http://schemas.microsoft.com/office/drawing/2016/5/9/chartex" xmlns:cx4="http://schemas.microsoft.com/office/drawing/2016/5/10/chartex" xmlns:cx5="http://schemas.microsoft.com/office/drawing/2016/5/11/chartex" xmlns:cx6="http://schemas.microsoft.com/office/drawing/2016/5/12/chartex" xmlns:cx7="http://schemas.microsoft.com/office/drawing/2016/5/13/chartex" xmlns:cx8="http://schemas.microsoft.com/office/drawing/2016/5/14/chartex" xmlns:mc="http://schemas.openxmlformats.org/markup-compatibility/2006" xmlns:aink="http://schemas.microsoft.com/office/drawing/2016/ink" xmlns:am3d="http://schemas.microsoft.com/office/drawing/2017/model3d" xmlns:o="urn:schemas-microsoft-com:office:office" xmlns:oel="http://schemas.microsoft.com/office/2019/extlst" xmlns:r="http://schemas.openxmlformats.org/officeDocument/2006/relationships" xmlns:m="http://schemas.openxmlformats.org/officeDocument/2006/math" xmlns:v="urn:schemas-microsoft-com:vml" xmlns:wp14="http://schemas.microsoft.com/office/word/2010/wordprocessingDrawing" xmlns:wp="http://schemas.openxmlformats.org/drawingml/2006/wordprocessingDrawing" xmlns:w10="urn:schemas-microsoft-com:office:word" xmlns:w="http://schemas.openxmlformats.org/wordprocessingml/2006/main" xmlns:w14="http://schemas.microsoft.com/office/word/2010/wordml" xmlns:w15="http://schemas.microsoft.com/office/word/2012/wordml" xmlns:w16cex="http://schemas.microsoft.com/office/word/2018/wordml/cex" xmlns:w16cid="http://schemas.microsoft.com/office/word/2016/wordml/cid" xmlns:w16="http://schemas.microsoft.com/office/word/2018/wordml" xmlns:w16sdtdh="http://schemas.microsoft.com/office/word/2020/wordml/sdtdatahash" xmlns:w16se="http://schemas.microsoft.com/office/word/2015/wordml/symex" xmlns:wpg="http://schemas.microsoft.com/office/word/2010/wordprocessingGroup" xmlns:wpi="http://schemas.microsoft.com/office/word/2010/wordprocessingInk" xmlns:wne="http://schemas.microsoft.com/office/word/2006/wordml" xmlns:wps="http://schemas.microsoft.com/office/word/2010/wordprocessingShape" mc:Ignorable="w14 w15 w16se w16cid w16 w16cex w16sdtdh wp14">
   <w:body>
     <w:tbl>
       <w:tblPr>
-        <w:tblpPr w:leftFromText="180" w:rightFromText="180" w:vertAnchor="page" w:horzAnchor="margin" w:tblpX="-102" w:tblpY="899"/>
-        <w:tblW w:w="5120" w:type="pct"/>
+        <w:tblpPr w:leftFromText="180" w:rightFromText="180" w:vertAnchor="page" w:horzAnchor="margin" w:tblpXSpec="center" w:tblpY="797"/>
+        <w:tblW w:w="5131" w:type="pct"/>
         <w:tblLayout w:type="fixed"/>
         <w:tblLook w:val="01E0" w:firstRow="1" w:lastRow="1" w:firstColumn="1" w:lastColumn="1" w:noHBand="0" w:noVBand="0"/>
       </w:tblPr>
       <w:tblGrid>
-        <w:gridCol w:w="2094"/>
-        <w:gridCol w:w="426"/>
-        <w:gridCol w:w="990"/>
-        <w:gridCol w:w="3401"/>
-        <w:gridCol w:w="852"/>
-        <w:gridCol w:w="569"/>
-        <w:gridCol w:w="2159"/>
+        <w:gridCol w:w="2079"/>
+        <w:gridCol w:w="423"/>
+        <w:gridCol w:w="974"/>
+        <w:gridCol w:w="15"/>
+        <w:gridCol w:w="2967"/>
+        <w:gridCol w:w="422"/>
+        <w:gridCol w:w="855"/>
+        <w:gridCol w:w="562"/>
+        <w:gridCol w:w="2158"/>
       </w:tblGrid>
-      <w:tr>
-        <w:trPr>
-          <w:trHeight w:val="58"/>
-        </w:trPr>
-        <w:tc>
-          <w:tcPr>
-            <w:tcW w:w="5000" w:type="pct"/>
-            <w:gridSpan w:val="7"/>
-            <w:shd w:val="clear" w:color="auto" w:fill="auto"/>
-            <w:vAlign w:val="bottom"/>
-          </w:tcPr>
-          <w:p>
-            <w:pPr>
-              <w:jc w:val="center"/>
-              <w:rPr>
-                <w:rFonts w:ascii="Calibri" w:hAnsi="Calibri" w:cs="Calibri"/>
-                <w:b/>
-                <w:smallCaps/>
-                <w:spacing w:val="40"/>
-                <w:sz w:val="32"/>
-                <w:szCs w:val="40"/>
-              </w:rPr>
-            </w:pPr>
-            <w:r>
-              <w:rPr>
-                <w:rFonts w:ascii="Calibri" w:hAnsi="Calibri" w:cs="Calibri"/>
-                <w:b/>
-                <w:smallCaps/>
-                <w:spacing w:val="40"/>
-                <w:sz w:val="32"/>
-                <w:szCs w:val="40"/>
-              </w:rPr>
-              <w:t>Harshit Jindal</w:t>
-            </w:r>
-          </w:p>
-          <w:p>
-            <w:pPr>
-              <w:jc w:val="center"/>
-              <w:rPr>
-                <w:rFonts w:ascii="Calibri" w:hAnsi="Calibri" w:cs="Calibri"/>
-                <w:sz w:val="20"/>
-                <w:szCs w:val="20"/>
-              </w:rPr>
-            </w:pPr>
-            <w:r>
-              <w:rPr>
-                <w:rFonts w:ascii="Calibri" w:hAnsi="Calibri" w:cs="Calibri"/>
-                <w:sz w:val="20"/>
-                <w:szCs w:val="20"/>
-              </w:rPr>
-              <w:t>Software Engineer</w:t>
-            </w:r>
-          </w:p>
-        </w:tc>
-      </w:tr>
-      <w:tr>
-        <w:trPr>
-          <w:trHeight w:val="142"/>
-        </w:trPr>
-        <w:tc>
-          <w:tcPr>
-            <w:tcW w:w="5000" w:type="pct"/>
-            <w:gridSpan w:val="7"/>
-            <w:shd w:val="clear" w:color="auto" w:fill="auto"/>
-            <w:vAlign w:val="bottom"/>
-          </w:tcPr>
-          <w:p>
-            <w:pPr>
-              <w:jc w:val="center"/>
-              <w:rPr>
-                <w:rFonts w:ascii="Calibri" w:hAnsi="Calibri" w:cs="Calibri"/>
-                <w:sz w:val="20"/>
-                <w:szCs w:val="20"/>
-              </w:rPr>
-            </w:pPr>
-            <w:r>
-              <w:rPr>
-                <w:rFonts w:ascii="Calibri" w:hAnsi="Calibri" w:cs="Calibri"/>
-                <w:sz w:val="18"/>
-                <w:szCs w:val="18"/>
-              </w:rPr>
-              <w:t>+91 883-7777409</w:t>
-            </w:r>
-            <w:r>
-              <w:rPr>
-                <w:rFonts w:ascii="Calibri" w:hAnsi="Calibri" w:cs="Calibri"/>
-                <w:sz w:val="18"/>
-                <w:szCs w:val="18"/>
-              </w:rPr>
-              <w:t xml:space="preserve"> | </w:t>
-            </w:r>
-            <w:hyperlink r:id="rId8" w:tooltip="contact@harshitjindal.com" w:history="1">
-              <w:r>
-                <w:rPr>
-                  <w:rStyle w:val="Hyperlink"/>
-                  <w:rFonts w:ascii="Calibri" w:hAnsi="Calibri" w:cs="Calibri"/>
-                  <w:sz w:val="20"/>
-                  <w:szCs w:val="20"/>
-                </w:rPr>
-                <w:t>contact@harshitjindal.com</w:t>
-              </w:r>
-            </w:hyperlink>
-            <w:r>
-              <w:rPr>
-                <w:rFonts w:ascii="Calibri" w:hAnsi="Calibri" w:cs="Calibri"/>
-                <w:sz w:val="20"/>
-                <w:szCs w:val="20"/>
-              </w:rPr>
-              <w:t xml:space="preserve"> </w:t>
-            </w:r>
-          </w:p>
-        </w:tc>
-      </w:tr>
-      <w:tr>
-        <w:trPr>
-          <w:trHeight w:val="142"/>
-        </w:trPr>
-        <w:tc>
-          <w:tcPr>
-            <w:tcW w:w="5000" w:type="pct"/>
-            <w:gridSpan w:val="7"/>
-            <w:shd w:val="clear" w:color="auto" w:fill="auto"/>
-            <w:vAlign w:val="bottom"/>
-          </w:tcPr>
-          <w:p>
-            <w:pPr>
-              <w:jc w:val="center"/>
-              <w:rPr>
-                <w:rFonts w:ascii="Calibri" w:hAnsi="Calibri" w:cs="Calibri"/>
-                <w:sz w:val="18"/>
-                <w:szCs w:val="18"/>
-              </w:rPr>
-            </w:pPr>
-          </w:p>
-        </w:tc>
-      </w:tr>
-      <w:tr>
-        <w:trPr>
-          <w:trHeight w:val="142"/>
-        </w:trPr>
-        <w:tc>
-          <w:tcPr>
-            <w:tcW w:w="5000" w:type="pct"/>
-            <w:gridSpan w:val="7"/>
-            <w:shd w:val="clear" w:color="auto" w:fill="auto"/>
-            <w:vAlign w:val="bottom"/>
-          </w:tcPr>
-          <w:p>
-            <w:pPr>
-              <w:jc w:val="center"/>
-              <w:rPr>
-                <w:rFonts w:ascii="Calibri" w:hAnsi="Calibri" w:cs="Calibri"/>
-                <w:sz w:val="18"/>
-                <w:szCs w:val="18"/>
-              </w:rPr>
-            </w:pPr>
-          </w:p>
-        </w:tc>
-      </w:tr>
       <w:tr>
         <w:trPr>
           <w:trHeight w:val="56"/>
@@ -184,7 +27,179 @@
         <w:tc>
           <w:tcPr>
             <w:tcW w:w="5000" w:type="pct"/>
-            <w:gridSpan w:val="7"/>
+            <w:gridSpan w:val="9"/>
+            <w:shd w:val="clear" w:color="auto" w:fill="auto"/>
+            <w:vAlign w:val="bottom"/>
+          </w:tcPr>
+          <w:p>
+            <w:pPr>
+              <w:jc w:val="center"/>
+              <w:rPr>
+                <w:rFonts w:ascii="Calibri" w:hAnsi="Calibri" w:cs="Calibri"/>
+                <w:b/>
+                <w:smallCaps/>
+                <w:spacing w:val="40"/>
+                <w:sz w:val="32"/>
+                <w:szCs w:val="40"/>
+              </w:rPr>
+            </w:pPr>
+            <w:r>
+              <w:rPr>
+                <w:rFonts w:ascii="Calibri" w:hAnsi="Calibri" w:cs="Calibri"/>
+                <w:b/>
+                <w:smallCaps/>
+                <w:spacing w:val="40"/>
+                <w:sz w:val="32"/>
+                <w:szCs w:val="40"/>
+              </w:rPr>
+              <w:t>Harshit Jindal</w:t>
+            </w:r>
+          </w:p>
+          <w:p>
+            <w:pPr>
+              <w:jc w:val="center"/>
+              <w:rPr>
+                <w:rFonts w:ascii="Calibri" w:hAnsi="Calibri" w:cs="Calibri"/>
+                <w:sz w:val="20"/>
+                <w:szCs w:val="20"/>
+              </w:rPr>
+            </w:pPr>
+            <w:r>
+              <w:rPr>
+                <w:rFonts w:ascii="Calibri" w:hAnsi="Calibri" w:cs="Calibri"/>
+                <w:sz w:val="20"/>
+                <w:szCs w:val="20"/>
+              </w:rPr>
+              <w:t>Software Engineer</w:t>
+            </w:r>
+            <w:r>
+              <w:rPr>
+                <w:rFonts w:ascii="Calibri" w:hAnsi="Calibri" w:cs="Calibri"/>
+                <w:sz w:val="20"/>
+                <w:szCs w:val="20"/>
+              </w:rPr>
+              <w:t xml:space="preserve"> </w:t>
+            </w:r>
+          </w:p>
+        </w:tc>
+      </w:tr>
+      <w:tr>
+        <w:trPr>
+          <w:trHeight w:val="140"/>
+        </w:trPr>
+        <w:tc>
+          <w:tcPr>
+            <w:tcW w:w="5000" w:type="pct"/>
+            <w:gridSpan w:val="9"/>
+            <w:shd w:val="clear" w:color="auto" w:fill="auto"/>
+            <w:vAlign w:val="bottom"/>
+          </w:tcPr>
+          <w:p>
+            <w:pPr>
+              <w:jc w:val="center"/>
+              <w:rPr>
+                <w:rFonts w:ascii="Calibri" w:hAnsi="Calibri" w:cs="Calibri"/>
+                <w:sz w:val="20"/>
+                <w:szCs w:val="20"/>
+              </w:rPr>
+            </w:pPr>
+            <w:r>
+              <w:rPr>
+                <w:rFonts w:ascii="Calibri" w:hAnsi="Calibri" w:cs="Calibri"/>
+                <w:sz w:val="18"/>
+                <w:szCs w:val="18"/>
+              </w:rPr>
+              <w:t>+91 883-77774</w:t>
+            </w:r>
+            <w:bookmarkStart w:id="0" w:name="_Hlk144187896"/>
+            <w:r>
+              <w:rPr>
+                <w:rFonts w:ascii="Calibri" w:hAnsi="Calibri" w:cs="Calibri"/>
+                <w:sz w:val="18"/>
+                <w:szCs w:val="18"/>
+              </w:rPr>
+              <w:t xml:space="preserve">09 </w:t>
+            </w:r>
+            <w:bookmarkStart w:id="1" w:name="_Hlk144187952"/>
+            <w:r>
+              <w:rPr>
+                <w:rFonts w:ascii="Calibri" w:hAnsi="Calibri" w:cs="Calibri"/>
+                <w:sz w:val="18"/>
+                <w:szCs w:val="18"/>
+              </w:rPr>
+              <w:t xml:space="preserve">| </w:t>
+            </w:r>
+            <w:bookmarkEnd w:id="0"/>
+            <w:r>
+              <w:fldChar w:fldCharType="begin"/>
+            </w:r>
+            <w:r>
+              <w:instrText>HYPERLINK "mailto:contact@harshitjindal.com" \o "contact@harshitjindal.com"</w:instrText>
+            </w:r>
+            <w:r>
+              <w:fldChar w:fldCharType="separate"/>
+            </w:r>
+            <w:r>
+              <w:rPr>
+                <w:rStyle w:val="Hyperlink"/>
+                <w:rFonts w:ascii="Calibri" w:hAnsi="Calibri" w:cs="Calibri"/>
+                <w:sz w:val="20"/>
+                <w:szCs w:val="20"/>
+              </w:rPr>
+              <w:t>contact@harshitjindal.com</w:t>
+            </w:r>
+            <w:r>
+              <w:rPr>
+                <w:rStyle w:val="Hyperlink"/>
+                <w:rFonts w:ascii="Calibri" w:hAnsi="Calibri" w:cs="Calibri"/>
+                <w:sz w:val="20"/>
+                <w:szCs w:val="20"/>
+              </w:rPr>
+              <w:fldChar w:fldCharType="end"/>
+            </w:r>
+            <w:bookmarkEnd w:id="1"/>
+            <w:r>
+              <w:rPr>
+                <w:rFonts w:ascii="Calibri" w:hAnsi="Calibri" w:cs="Calibri"/>
+                <w:sz w:val="20"/>
+                <w:szCs w:val="20"/>
+              </w:rPr>
+              <w:t xml:space="preserve"> </w:t>
+            </w:r>
+          </w:p>
+        </w:tc>
+      </w:tr>
+      <w:tr>
+        <w:trPr>
+          <w:trHeight w:val="140"/>
+        </w:trPr>
+        <w:tc>
+          <w:tcPr>
+            <w:tcW w:w="5000" w:type="pct"/>
+            <w:gridSpan w:val="9"/>
+            <w:shd w:val="clear" w:color="auto" w:fill="auto"/>
+            <w:vAlign w:val="bottom"/>
+          </w:tcPr>
+          <w:p>
+            <w:pPr>
+              <w:jc w:val="center"/>
+              <w:rPr>
+                <w:rFonts w:ascii="Calibri" w:hAnsi="Calibri" w:cs="Calibri"/>
+                <w:sz w:val="18"/>
+                <w:szCs w:val="18"/>
+              </w:rPr>
+            </w:pPr>
+          </w:p>
+        </w:tc>
+      </w:tr>
+      <w:tr>
+        <w:trPr>
+          <w:trHeight w:val="54"/>
+        </w:trPr>
+        <w:tc>
+          <w:tcPr>
+            <w:tcW w:w="5000" w:type="pct"/>
+            <w:gridSpan w:val="9"/>
             <w:tcBorders>
               <w:bottom w:val="single" w:sz="4" w:space="0" w:color="auto"/>
             </w:tcBorders>
@@ -215,11 +230,11 @@
       </w:tr>
       <w:tr>
         <w:trPr>
-          <w:trHeight w:val="48"/>
+          <w:trHeight w:val="46"/>
         </w:trPr>
         <w:tc>
           <w:tcPr>
-            <w:tcW w:w="1201" w:type="pct"/>
+            <w:tcW w:w="1196" w:type="pct"/>
             <w:gridSpan w:val="2"/>
             <w:tcBorders>
               <w:top w:val="single" w:sz="4" w:space="0" w:color="auto"/>
@@ -236,6 +251,7 @@
                 <w:szCs w:val="20"/>
               </w:rPr>
             </w:pPr>
+            <w:bookmarkStart w:id="2" w:name="_Hlk144189404"/>
             <w:r>
               <w:rPr>
                 <w:rFonts w:ascii="Calibri" w:hAnsi="Calibri" w:cs="Calibri"/>
@@ -245,14 +261,14 @@
                 <w:sz w:val="20"/>
                 <w:szCs w:val="20"/>
               </w:rPr>
-              <w:t>Software Engineer</w:t>
+              <w:t>Associate</w:t>
             </w:r>
           </w:p>
         </w:tc>
         <w:tc>
           <w:tcPr>
-            <w:tcW w:w="2499" w:type="pct"/>
-            <w:gridSpan w:val="3"/>
+            <w:tcW w:w="2503" w:type="pct"/>
+            <w:gridSpan w:val="5"/>
             <w:tcBorders>
               <w:top w:val="single" w:sz="4" w:space="0" w:color="auto"/>
             </w:tcBorders>
@@ -285,7 +301,7 @@
         </w:tc>
         <w:tc>
           <w:tcPr>
-            <w:tcW w:w="1300" w:type="pct"/>
+            <w:tcW w:w="1301" w:type="pct"/>
             <w:gridSpan w:val="2"/>
             <w:tcBorders>
               <w:top w:val="single" w:sz="4" w:space="0" w:color="auto"/>
@@ -316,12 +332,12 @@
       </w:tr>
       <w:tr>
         <w:trPr>
-          <w:trHeight w:val="71"/>
+          <w:trHeight w:val="69"/>
         </w:trPr>
         <w:tc>
           <w:tcPr>
             <w:tcW w:w="5000" w:type="pct"/>
-            <w:gridSpan w:val="7"/>
+            <w:gridSpan w:val="9"/>
             <w:shd w:val="clear" w:color="auto" w:fill="auto"/>
           </w:tcPr>
           <w:p>
@@ -334,51 +350,30 @@
                 <w:tab w:val="clear" w:pos="720"/>
               </w:tabs>
               <w:ind w:left="252" w:hanging="180"/>
+              <w:jc w:val="both"/>
               <w:rPr>
                 <w:rFonts w:ascii="Calibri" w:hAnsi="Calibri" w:cs="Calibri"/>
                 <w:sz w:val="20"/>
                 <w:szCs w:val="20"/>
               </w:rPr>
             </w:pPr>
-            <w:r>
-              <w:rPr>
-                <w:rFonts w:ascii="Calibri" w:hAnsi="Calibri" w:cs="Calibri"/>
-                <w:sz w:val="20"/>
-                <w:szCs w:val="20"/>
-              </w:rPr>
-              <w:t xml:space="preserve">Working on backend API development to enable new features and enhance existing processes around the credit and fraud </w:t>
-            </w:r>
-            <w:r>
-              <w:rPr>
-                <w:rFonts w:ascii="Calibri" w:hAnsi="Calibri" w:cs="Calibri"/>
-                <w:sz w:val="20"/>
-                <w:szCs w:val="20"/>
-              </w:rPr>
-              <w:t>machine-learning</w:t>
-            </w:r>
-            <w:r>
-              <w:rPr>
-                <w:rFonts w:ascii="Calibri" w:hAnsi="Calibri" w:cs="Calibri"/>
-                <w:sz w:val="20"/>
-                <w:szCs w:val="20"/>
-              </w:rPr>
-              <w:t xml:space="preserve"> model </w:t>
-            </w:r>
-            <w:r>
-              <w:rPr>
-                <w:rFonts w:ascii="Calibri" w:hAnsi="Calibri" w:cs="Calibri"/>
-                <w:sz w:val="20"/>
-                <w:szCs w:val="20"/>
-              </w:rPr>
-              <w:t xml:space="preserve">builds and </w:t>
-            </w:r>
-            <w:r>
-              <w:rPr>
-                <w:rFonts w:ascii="Calibri" w:hAnsi="Calibri" w:cs="Calibri"/>
-                <w:sz w:val="20"/>
-                <w:szCs w:val="20"/>
-              </w:rPr>
-              <w:t>deployments.</w:t>
+            <w:bookmarkStart w:id="3" w:name="_Hlk144188629"/>
+            <w:r>
+              <w:rPr>
+                <w:rFonts w:ascii="Calibri" w:hAnsi="Calibri" w:cs="Calibri"/>
+                <w:sz w:val="20"/>
+                <w:szCs w:val="20"/>
+              </w:rPr>
+              <w:t xml:space="preserve">Working on backend development </w:t>
+            </w:r>
+            <w:bookmarkEnd w:id="3"/>
+            <w:r>
+              <w:rPr>
+                <w:rFonts w:ascii="Calibri" w:hAnsi="Calibri" w:cs="Calibri"/>
+                <w:sz w:val="20"/>
+                <w:szCs w:val="20"/>
+              </w:rPr>
+              <w:t>for the application responsible for the development, testing, and deployment of Machine Learning (ML) models at Amex.</w:t>
             </w:r>
           </w:p>
           <w:p>
@@ -391,6 +386,7 @@
                 <w:tab w:val="clear" w:pos="720"/>
               </w:tabs>
               <w:ind w:left="252" w:hanging="180"/>
+              <w:jc w:val="both"/>
               <w:rPr>
                 <w:rFonts w:ascii="Calibri" w:hAnsi="Calibri" w:cs="Calibri"/>
                 <w:sz w:val="20"/>
@@ -403,191 +399,23 @@
                 <w:sz w:val="20"/>
                 <w:szCs w:val="20"/>
               </w:rPr>
-              <w:t xml:space="preserve">Mentored and led </w:t>
-            </w:r>
-            <w:r>
-              <w:rPr>
-                <w:rFonts w:ascii="Calibri" w:hAnsi="Calibri" w:cs="Calibri"/>
-                <w:sz w:val="20"/>
-                <w:szCs w:val="20"/>
-              </w:rPr>
-              <w:t>seven</w:t>
-            </w:r>
-            <w:r>
-              <w:rPr>
-                <w:rFonts w:ascii="Calibri" w:hAnsi="Calibri" w:cs="Calibri"/>
-                <w:sz w:val="20"/>
-                <w:szCs w:val="20"/>
-              </w:rPr>
-              <w:t xml:space="preserve"> </w:t>
-            </w:r>
-            <w:r>
-              <w:rPr>
-                <w:rFonts w:ascii="Calibri" w:hAnsi="Calibri" w:cs="Calibri"/>
-                <w:sz w:val="20"/>
-                <w:szCs w:val="20"/>
-              </w:rPr>
-              <w:t xml:space="preserve">new </w:t>
-            </w:r>
-            <w:r>
-              <w:rPr>
-                <w:rFonts w:ascii="Calibri" w:hAnsi="Calibri" w:cs="Calibri"/>
-                <w:sz w:val="20"/>
-                <w:szCs w:val="20"/>
-              </w:rPr>
-              <w:t xml:space="preserve">colleagues </w:t>
-            </w:r>
-            <w:r>
-              <w:rPr>
-                <w:rFonts w:ascii="Calibri" w:hAnsi="Calibri" w:cs="Calibri"/>
-                <w:sz w:val="20"/>
-                <w:szCs w:val="20"/>
-              </w:rPr>
-              <w:t>to b</w:t>
-            </w:r>
-            <w:r>
-              <w:rPr>
-                <w:rFonts w:ascii="Calibri" w:hAnsi="Calibri" w:cs="Calibri"/>
-                <w:sz w:val="20"/>
-                <w:szCs w:val="20"/>
-              </w:rPr>
-              <w:t>uil</w:t>
-            </w:r>
-            <w:r>
-              <w:rPr>
-                <w:rFonts w:ascii="Calibri" w:hAnsi="Calibri" w:cs="Calibri"/>
-                <w:sz w:val="20"/>
-                <w:szCs w:val="20"/>
-              </w:rPr>
-              <w:t>d</w:t>
-            </w:r>
-            <w:r>
-              <w:rPr>
-                <w:rFonts w:ascii="Calibri" w:hAnsi="Calibri" w:cs="Calibri"/>
-                <w:sz w:val="20"/>
-                <w:szCs w:val="20"/>
-              </w:rPr>
-              <w:t xml:space="preserve"> </w:t>
-            </w:r>
-            <w:r>
-              <w:rPr>
-                <w:rFonts w:ascii="Calibri" w:hAnsi="Calibri" w:cs="Calibri"/>
-                <w:sz w:val="20"/>
-                <w:szCs w:val="20"/>
-              </w:rPr>
-              <w:t>python</w:t>
-            </w:r>
-            <w:r>
-              <w:rPr>
-                <w:rFonts w:ascii="Calibri" w:hAnsi="Calibri" w:cs="Calibri"/>
-                <w:sz w:val="20"/>
-                <w:szCs w:val="20"/>
-              </w:rPr>
-              <w:t xml:space="preserve"> </w:t>
-            </w:r>
-            <w:r>
-              <w:rPr>
-                <w:rFonts w:ascii="Calibri" w:hAnsi="Calibri" w:cs="Calibri"/>
-                <w:sz w:val="20"/>
-                <w:szCs w:val="20"/>
-              </w:rPr>
-              <w:t>modules</w:t>
-            </w:r>
-            <w:r>
-              <w:rPr>
-                <w:rFonts w:ascii="Calibri" w:hAnsi="Calibri" w:cs="Calibri"/>
-                <w:sz w:val="20"/>
-                <w:szCs w:val="20"/>
-              </w:rPr>
-              <w:t xml:space="preserve"> and standalone </w:t>
-            </w:r>
-            <w:r>
-              <w:rPr>
-                <w:rFonts w:ascii="Calibri" w:hAnsi="Calibri" w:cs="Calibri"/>
-                <w:sz w:val="20"/>
-                <w:szCs w:val="20"/>
-              </w:rPr>
-              <w:t>software tools</w:t>
-            </w:r>
-            <w:r>
-              <w:rPr>
-                <w:rFonts w:ascii="Calibri" w:hAnsi="Calibri" w:cs="Calibri"/>
-                <w:sz w:val="20"/>
-                <w:szCs w:val="20"/>
-              </w:rPr>
-              <w:t>,</w:t>
-            </w:r>
-            <w:r>
-              <w:rPr>
-                <w:rFonts w:ascii="Calibri" w:hAnsi="Calibri" w:cs="Calibri"/>
-                <w:sz w:val="20"/>
-                <w:szCs w:val="20"/>
-              </w:rPr>
-              <w:t xml:space="preserve"> aid</w:t>
-            </w:r>
-            <w:r>
-              <w:rPr>
-                <w:rFonts w:ascii="Calibri" w:hAnsi="Calibri" w:cs="Calibri"/>
-                <w:sz w:val="20"/>
-                <w:szCs w:val="20"/>
-              </w:rPr>
-              <w:t>ing</w:t>
-            </w:r>
-            <w:r>
-              <w:rPr>
-                <w:rFonts w:ascii="Calibri" w:hAnsi="Calibri" w:cs="Calibri"/>
-                <w:sz w:val="20"/>
-                <w:szCs w:val="20"/>
-              </w:rPr>
-              <w:t xml:space="preserve"> the Decision Science teams in developing </w:t>
-            </w:r>
-            <w:r>
-              <w:rPr>
-                <w:rFonts w:ascii="Calibri" w:hAnsi="Calibri" w:cs="Calibri"/>
-                <w:sz w:val="20"/>
-                <w:szCs w:val="20"/>
-              </w:rPr>
-              <w:t xml:space="preserve">and upgrading the </w:t>
-            </w:r>
-            <w:r>
-              <w:rPr>
-                <w:rFonts w:ascii="Calibri" w:hAnsi="Calibri" w:cs="Calibri"/>
-                <w:sz w:val="20"/>
-                <w:szCs w:val="20"/>
-              </w:rPr>
-              <w:t xml:space="preserve">ML </w:t>
-            </w:r>
-            <w:r>
-              <w:rPr>
-                <w:rFonts w:ascii="Calibri" w:hAnsi="Calibri" w:cs="Calibri"/>
-                <w:sz w:val="20"/>
-                <w:szCs w:val="20"/>
-              </w:rPr>
-              <w:t xml:space="preserve">models </w:t>
-            </w:r>
-            <w:r>
-              <w:rPr>
-                <w:rFonts w:ascii="Calibri" w:hAnsi="Calibri" w:cs="Calibri"/>
-                <w:sz w:val="20"/>
-                <w:szCs w:val="20"/>
-              </w:rPr>
-              <w:t xml:space="preserve">more </w:t>
-            </w:r>
-            <w:r>
-              <w:rPr>
-                <w:rFonts w:ascii="Calibri" w:hAnsi="Calibri" w:cs="Calibri"/>
-                <w:sz w:val="20"/>
-                <w:szCs w:val="20"/>
-              </w:rPr>
-              <w:t>efficiently</w:t>
-            </w:r>
-            <w:r>
-              <w:rPr>
-                <w:rFonts w:ascii="Calibri" w:hAnsi="Calibri" w:cs="Calibri"/>
-                <w:sz w:val="20"/>
-                <w:szCs w:val="20"/>
-              </w:rPr>
-              <w:t>.</w:t>
+              <w:t>Designed and developed the CI/CD pipeline for the application with over 50 KSLOC using Jenkins and XLR, in addition</w:t>
+            </w:r>
+            <w:r>
+              <w:rPr>
+                <w:rFonts w:ascii="Calibri" w:hAnsi="Calibri" w:cs="Calibri"/>
+                <w:sz w:val="20"/>
+                <w:szCs w:val="20"/>
+              </w:rPr>
+              <w:t xml:space="preserve"> to</w:t>
+            </w:r>
+            <w:r>
+              <w:rPr>
+                <w:rFonts w:ascii="Calibri" w:hAnsi="Calibri" w:cs="Calibri"/>
+                <w:sz w:val="20"/>
+                <w:szCs w:val="20"/>
+              </w:rPr>
+              <w:t xml:space="preserve"> managing the application infra and environment planning.</w:t>
             </w:r>
           </w:p>
           <w:p>
@@ -600,6 +428,7 @@
                 <w:tab w:val="clear" w:pos="720"/>
               </w:tabs>
               <w:ind w:left="252" w:hanging="180"/>
+              <w:jc w:val="both"/>
               <w:rPr>
                 <w:rFonts w:ascii="Calibri" w:hAnsi="Calibri" w:cs="Calibri"/>
                 <w:sz w:val="20"/>
@@ -612,15 +441,127 @@
                 <w:sz w:val="20"/>
                 <w:szCs w:val="20"/>
               </w:rPr>
-              <w:t xml:space="preserve">Parallelly, migrating </w:t>
-            </w:r>
-            <w:r>
-              <w:rPr>
-                <w:rFonts w:ascii="Calibri" w:hAnsi="Calibri" w:cs="Calibri"/>
-                <w:sz w:val="20"/>
-                <w:szCs w:val="20"/>
-              </w:rPr>
-              <w:t>my</w:t>
+              <w:t>Held responsibility for m</w:t>
+            </w:r>
+            <w:r>
+              <w:rPr>
+                <w:rFonts w:ascii="Calibri" w:hAnsi="Calibri" w:cs="Calibri"/>
+                <w:sz w:val="20"/>
+                <w:szCs w:val="20"/>
+              </w:rPr>
+              <w:t>entor</w:t>
+            </w:r>
+            <w:r>
+              <w:rPr>
+                <w:rFonts w:ascii="Calibri" w:hAnsi="Calibri" w:cs="Calibri"/>
+                <w:sz w:val="20"/>
+                <w:szCs w:val="20"/>
+              </w:rPr>
+              <w:t>ing</w:t>
+            </w:r>
+            <w:r>
+              <w:rPr>
+                <w:rFonts w:ascii="Calibri" w:hAnsi="Calibri" w:cs="Calibri"/>
+                <w:sz w:val="20"/>
+                <w:szCs w:val="20"/>
+              </w:rPr>
+              <w:t xml:space="preserve"> and le</w:t>
+            </w:r>
+            <w:r>
+              <w:rPr>
+                <w:rFonts w:ascii="Calibri" w:hAnsi="Calibri" w:cs="Calibri"/>
+                <w:sz w:val="20"/>
+                <w:szCs w:val="20"/>
+              </w:rPr>
+              <w:t>a</w:t>
+            </w:r>
+            <w:r>
+              <w:rPr>
+                <w:rFonts w:ascii="Calibri" w:hAnsi="Calibri" w:cs="Calibri"/>
+                <w:sz w:val="20"/>
+                <w:szCs w:val="20"/>
+              </w:rPr>
+              <w:t>d</w:t>
+            </w:r>
+            <w:r>
+              <w:rPr>
+                <w:rFonts w:ascii="Calibri" w:hAnsi="Calibri" w:cs="Calibri"/>
+                <w:sz w:val="20"/>
+                <w:szCs w:val="20"/>
+              </w:rPr>
+              <w:t>ing</w:t>
+            </w:r>
+            <w:r>
+              <w:rPr>
+                <w:rFonts w:ascii="Calibri" w:hAnsi="Calibri" w:cs="Calibri"/>
+                <w:sz w:val="20"/>
+                <w:szCs w:val="20"/>
+              </w:rPr>
+              <w:t xml:space="preserve"> seven new colleagues </w:t>
+            </w:r>
+            <w:r>
+              <w:rPr>
+                <w:rFonts w:ascii="Calibri" w:hAnsi="Calibri" w:cs="Calibri"/>
+                <w:sz w:val="20"/>
+                <w:szCs w:val="20"/>
+              </w:rPr>
+              <w:t xml:space="preserve">in 2022 </w:t>
+            </w:r>
+            <w:r>
+              <w:rPr>
+                <w:rFonts w:ascii="Calibri" w:hAnsi="Calibri" w:cs="Calibri"/>
+                <w:sz w:val="20"/>
+                <w:szCs w:val="20"/>
+              </w:rPr>
+              <w:t xml:space="preserve">to build python modules and standalone </w:t>
+            </w:r>
+            <w:r>
+              <w:rPr>
+                <w:rFonts w:ascii="Calibri" w:hAnsi="Calibri" w:cs="Calibri"/>
+                <w:sz w:val="20"/>
+                <w:szCs w:val="20"/>
+              </w:rPr>
+              <w:t xml:space="preserve">software </w:t>
+            </w:r>
+            <w:r>
+              <w:rPr>
+                <w:rFonts w:ascii="Calibri" w:hAnsi="Calibri" w:cs="Calibri"/>
+                <w:sz w:val="20"/>
+                <w:szCs w:val="20"/>
+              </w:rPr>
+              <w:t>capabilities</w:t>
+            </w:r>
+            <w:r>
+              <w:rPr>
+                <w:rFonts w:ascii="Calibri" w:hAnsi="Calibri" w:cs="Calibri"/>
+                <w:sz w:val="20"/>
+                <w:szCs w:val="20"/>
+              </w:rPr>
+              <w:t>, aiding the Decision Science teams in developing and upgrading the ML models more efficiently.</w:t>
+            </w:r>
+            <w:r>
+              <w:rPr>
+                <w:rFonts w:ascii="Calibri" w:hAnsi="Calibri" w:cs="Calibri"/>
+                <w:sz w:val="20"/>
+                <w:szCs w:val="20"/>
+              </w:rPr>
+              <w:t xml:space="preserve"> This brought down the </w:t>
+            </w:r>
+            <w:r>
+              <w:rPr>
+                <w:rFonts w:ascii="Calibri" w:hAnsi="Calibri" w:cs="Calibri"/>
+                <w:sz w:val="20"/>
+                <w:szCs w:val="20"/>
+              </w:rPr>
+              <w:t>t</w:t>
+            </w:r>
+            <w:r>
+              <w:rPr>
+                <w:rFonts w:ascii="Calibri" w:hAnsi="Calibri" w:cs="Calibri"/>
+                <w:sz w:val="20"/>
+                <w:szCs w:val="20"/>
+              </w:rPr>
+              <w:t>ime</w:t>
             </w:r>
             <w:r>
               <w:rPr>
@@ -636,39 +577,65 @@
                 <w:sz w:val="20"/>
                 <w:szCs w:val="20"/>
               </w:rPr>
-              <w:t xml:space="preserve">team’s </w:t>
-            </w:r>
-            <w:r>
-              <w:rPr>
-                <w:rFonts w:ascii="Calibri" w:hAnsi="Calibri" w:cs="Calibri"/>
-                <w:sz w:val="20"/>
-                <w:szCs w:val="20"/>
-              </w:rPr>
-              <w:t xml:space="preserve">existing codebase to a </w:t>
-            </w:r>
-            <w:r>
-              <w:rPr>
-                <w:rFonts w:ascii="Calibri" w:hAnsi="Calibri" w:cs="Calibri"/>
-                <w:sz w:val="20"/>
-                <w:szCs w:val="20"/>
-              </w:rPr>
-              <w:t xml:space="preserve">containerized </w:t>
-            </w:r>
-            <w:r>
-              <w:rPr>
-                <w:rFonts w:ascii="Calibri" w:hAnsi="Calibri" w:cs="Calibri"/>
-                <w:sz w:val="20"/>
-                <w:szCs w:val="20"/>
-              </w:rPr>
-              <w:t>microservice</w:t>
-            </w:r>
-            <w:r>
-              <w:rPr>
-                <w:rFonts w:ascii="Calibri" w:hAnsi="Calibri" w:cs="Calibri"/>
-                <w:sz w:val="20"/>
-                <w:szCs w:val="20"/>
-              </w:rPr>
-              <w:t xml:space="preserve"> architecture on the in-house cloud.</w:t>
+              <w:t>to</w:t>
+            </w:r>
+            <w:r>
+              <w:rPr>
+                <w:rFonts w:ascii="Calibri" w:hAnsi="Calibri" w:cs="Calibri"/>
+                <w:sz w:val="20"/>
+                <w:szCs w:val="20"/>
+              </w:rPr>
+              <w:t xml:space="preserve"> m</w:t>
+            </w:r>
+            <w:r>
+              <w:rPr>
+                <w:rFonts w:ascii="Calibri" w:hAnsi="Calibri" w:cs="Calibri"/>
+                <w:sz w:val="20"/>
+                <w:szCs w:val="20"/>
+              </w:rPr>
+              <w:t>arket</w:t>
+            </w:r>
+            <w:r>
+              <w:rPr>
+                <w:rFonts w:ascii="Calibri" w:hAnsi="Calibri" w:cs="Calibri"/>
+                <w:sz w:val="20"/>
+                <w:szCs w:val="20"/>
+              </w:rPr>
+              <w:t xml:space="preserve"> (TTM)</w:t>
+            </w:r>
+            <w:r>
+              <w:rPr>
+                <w:rFonts w:ascii="Calibri" w:hAnsi="Calibri" w:cs="Calibri"/>
+                <w:sz w:val="20"/>
+                <w:szCs w:val="20"/>
+              </w:rPr>
+              <w:t xml:space="preserve"> by several weeks for each ML model, benefiting 20+ data science teams.</w:t>
+            </w:r>
+          </w:p>
+          <w:p>
+            <w:pPr>
+              <w:numPr>
+                <w:ilvl w:val="0"/>
+                <w:numId w:val="1"/>
+              </w:numPr>
+              <w:tabs>
+                <w:tab w:val="clear" w:pos="720"/>
+              </w:tabs>
+              <w:ind w:left="252" w:hanging="180"/>
+              <w:jc w:val="both"/>
+              <w:rPr>
+                <w:rFonts w:ascii="Calibri" w:hAnsi="Calibri" w:cs="Calibri"/>
+                <w:sz w:val="20"/>
+                <w:szCs w:val="20"/>
+              </w:rPr>
+            </w:pPr>
+            <w:r>
+              <w:rPr>
+                <w:rFonts w:ascii="Calibri" w:hAnsi="Calibri" w:cs="Calibri"/>
+                <w:sz w:val="20"/>
+                <w:szCs w:val="20"/>
+              </w:rPr>
+              <w:t>Promoted to Sr. Associate in Feb 2023.</w:t>
             </w:r>
           </w:p>
           <w:p>
@@ -683,13 +650,14 @@
           </w:p>
         </w:tc>
       </w:tr>
+      <w:bookmarkEnd w:id="2"/>
       <w:tr>
         <w:trPr>
-          <w:trHeight w:val="71"/>
+          <w:trHeight w:val="69"/>
         </w:trPr>
         <w:tc>
           <w:tcPr>
-            <w:tcW w:w="1201" w:type="pct"/>
+            <w:tcW w:w="1196" w:type="pct"/>
             <w:gridSpan w:val="2"/>
             <w:shd w:val="clear" w:color="auto" w:fill="auto"/>
           </w:tcPr>
@@ -718,8 +686,8 @@
         </w:tc>
         <w:tc>
           <w:tcPr>
-            <w:tcW w:w="2499" w:type="pct"/>
-            <w:gridSpan w:val="3"/>
+            <w:tcW w:w="2503" w:type="pct"/>
+            <w:gridSpan w:val="5"/>
             <w:shd w:val="clear" w:color="auto" w:fill="auto"/>
           </w:tcPr>
           <w:p>
@@ -748,7 +716,7 @@
         </w:tc>
         <w:tc>
           <w:tcPr>
-            <w:tcW w:w="1300" w:type="pct"/>
+            <w:tcW w:w="1301" w:type="pct"/>
             <w:gridSpan w:val="2"/>
             <w:shd w:val="clear" w:color="auto" w:fill="auto"/>
           </w:tcPr>
@@ -776,12 +744,12 @@
       </w:tr>
       <w:tr>
         <w:trPr>
-          <w:trHeight w:val="71"/>
+          <w:trHeight w:val="69"/>
         </w:trPr>
         <w:tc>
           <w:tcPr>
             <w:tcW w:w="5000" w:type="pct"/>
-            <w:gridSpan w:val="7"/>
+            <w:gridSpan w:val="9"/>
             <w:shd w:val="clear" w:color="auto" w:fill="auto"/>
           </w:tcPr>
           <w:p>
@@ -794,61 +762,24 @@
                 <w:tab w:val="clear" w:pos="720"/>
               </w:tabs>
               <w:ind w:left="252" w:hanging="180"/>
+              <w:jc w:val="both"/>
               <w:rPr>
                 <w:rFonts w:ascii="Calibri" w:hAnsi="Calibri" w:cs="Calibri"/>
                 <w:sz w:val="20"/>
                 <w:szCs w:val="20"/>
               </w:rPr>
             </w:pPr>
-            <w:r>
-              <w:rPr>
-                <w:rFonts w:ascii="Calibri" w:hAnsi="Calibri" w:cs="Calibri"/>
-                <w:sz w:val="20"/>
-                <w:szCs w:val="20"/>
-              </w:rPr>
-              <w:t>Programmed</w:t>
-            </w:r>
-            <w:r>
-              <w:rPr>
-                <w:rFonts w:ascii="Calibri" w:hAnsi="Calibri" w:cs="Calibri"/>
-                <w:sz w:val="20"/>
-                <w:szCs w:val="20"/>
-              </w:rPr>
-              <w:t xml:space="preserve"> </w:t>
-            </w:r>
-            <w:r>
-              <w:rPr>
-                <w:rFonts w:ascii="Calibri" w:hAnsi="Calibri" w:cs="Calibri"/>
-                <w:sz w:val="20"/>
-                <w:szCs w:val="20"/>
-              </w:rPr>
-              <w:t>six</w:t>
-            </w:r>
-            <w:r>
-              <w:rPr>
-                <w:rFonts w:ascii="Calibri" w:hAnsi="Calibri" w:cs="Calibri"/>
-                <w:sz w:val="20"/>
-                <w:szCs w:val="20"/>
-              </w:rPr>
-              <w:t xml:space="preserve"> manual processes into end-to-end automated pipelines using Selenium, Pandas, Requests</w:t>
-            </w:r>
-            <w:r>
-              <w:rPr>
-                <w:rFonts w:ascii="Calibri" w:hAnsi="Calibri" w:cs="Calibri"/>
-                <w:sz w:val="20"/>
-                <w:szCs w:val="20"/>
-              </w:rPr>
-              <w:t>,</w:t>
-            </w:r>
-            <w:r>
-              <w:rPr>
-                <w:rFonts w:ascii="Calibri" w:hAnsi="Calibri" w:cs="Calibri"/>
-                <w:sz w:val="20"/>
-                <w:szCs w:val="20"/>
-              </w:rPr>
-              <w:t xml:space="preserve"> and Flask.</w:t>
+            <w:bookmarkStart w:id="4" w:name="_Hlk144189098"/>
+            <w:r>
+              <w:rPr>
+                <w:rFonts w:ascii="Calibri" w:hAnsi="Calibri" w:cs="Calibri"/>
+                <w:sz w:val="20"/>
+                <w:szCs w:val="20"/>
+              </w:rPr>
+              <w:t>Programmed six manual processes into end-to-end automated pipelines using Selenium, Pandas, Requests, and Flask.</w:t>
             </w:r>
           </w:p>
+          <w:bookmarkEnd w:id="4"/>
           <w:p>
             <w:pPr>
               <w:numPr>
@@ -859,6 +790,7 @@
                 <w:tab w:val="clear" w:pos="720"/>
               </w:tabs>
               <w:ind w:left="252" w:hanging="180"/>
+              <w:jc w:val="both"/>
               <w:rPr>
                 <w:rFonts w:ascii="Calibri" w:hAnsi="Calibri" w:cs="Calibri"/>
                 <w:sz w:val="20"/>
@@ -871,23 +803,7 @@
                 <w:sz w:val="20"/>
                 <w:szCs w:val="20"/>
               </w:rPr>
-              <w:t>Coded 100+ rules for the Dynamic Authorization of Credit</w:t>
-            </w:r>
-            <w:r>
-              <w:rPr>
-                <w:rFonts w:ascii="Calibri" w:hAnsi="Calibri" w:cs="Calibri"/>
-                <w:sz w:val="20"/>
-                <w:szCs w:val="20"/>
-              </w:rPr>
-              <w:t xml:space="preserve"> (DAC)</w:t>
-            </w:r>
-            <w:r>
-              <w:rPr>
-                <w:rFonts w:ascii="Calibri" w:hAnsi="Calibri" w:cs="Calibri"/>
-                <w:sz w:val="20"/>
-                <w:szCs w:val="20"/>
-              </w:rPr>
-              <w:t xml:space="preserve"> system that utilize scores from in-house ML models to take the final decisions.</w:t>
+              <w:t>Coded 100+ rules for the Dynamic Authorization of Credit (DAC) system that utilize scores from in-house ML models to take the final decisions.</w:t>
             </w:r>
           </w:p>
           <w:p>
@@ -904,12 +820,12 @@
       </w:tr>
       <w:tr>
         <w:trPr>
-          <w:trHeight w:val="192"/>
+          <w:trHeight w:val="190"/>
         </w:trPr>
         <w:tc>
           <w:tcPr>
-            <w:tcW w:w="1673" w:type="pct"/>
-            <w:gridSpan w:val="3"/>
+            <w:tcW w:w="1669" w:type="pct"/>
+            <w:gridSpan w:val="4"/>
             <w:shd w:val="clear" w:color="auto" w:fill="auto"/>
           </w:tcPr>
           <w:p>
@@ -933,13 +849,36 @@
                 <w:sz w:val="20"/>
                 <w:szCs w:val="20"/>
               </w:rPr>
-              <w:t>iOS Developer, Intern</w:t>
+              <w:t>iOS Develop</w:t>
+            </w:r>
+            <w:r>
+              <w:rPr>
+                <w:rFonts w:ascii="Calibri" w:hAnsi="Calibri" w:cs="Calibri"/>
+                <w:b/>
+                <w:i/>
+                <w:iCs/>
+                <w:sz w:val="20"/>
+                <w:szCs w:val="20"/>
+              </w:rPr>
+              <w:t xml:space="preserve">ment </w:t>
+            </w:r>
+            <w:r>
+              <w:rPr>
+                <w:rFonts w:ascii="Calibri" w:hAnsi="Calibri" w:cs="Calibri"/>
+                <w:b/>
+                <w:i/>
+                <w:iCs/>
+                <w:sz w:val="20"/>
+                <w:szCs w:val="20"/>
+              </w:rPr>
+              <w:t>Intern</w:t>
             </w:r>
           </w:p>
         </w:tc>
         <w:tc>
           <w:tcPr>
             <w:tcW w:w="1621" w:type="pct"/>
+            <w:gridSpan w:val="2"/>
             <w:shd w:val="clear" w:color="auto" w:fill="auto"/>
           </w:tcPr>
           <w:p>
@@ -972,7 +911,7 @@
         </w:tc>
         <w:tc>
           <w:tcPr>
-            <w:tcW w:w="1706" w:type="pct"/>
+            <w:tcW w:w="1710" w:type="pct"/>
             <w:gridSpan w:val="3"/>
             <w:shd w:val="clear" w:color="auto" w:fill="auto"/>
           </w:tcPr>
@@ -1007,12 +946,12 @@
       </w:tr>
       <w:tr>
         <w:trPr>
-          <w:trHeight w:val="305"/>
+          <w:trHeight w:val="303"/>
         </w:trPr>
         <w:tc>
           <w:tcPr>
             <w:tcW w:w="5000" w:type="pct"/>
-            <w:gridSpan w:val="7"/>
+            <w:gridSpan w:val="9"/>
             <w:shd w:val="clear" w:color="auto" w:fill="auto"/>
           </w:tcPr>
           <w:p>
@@ -1025,6 +964,7 @@
                 <w:tab w:val="clear" w:pos="720"/>
               </w:tabs>
               <w:ind w:left="252" w:hanging="180"/>
+              <w:jc w:val="both"/>
               <w:rPr>
                 <w:rFonts w:ascii="Calibri" w:hAnsi="Calibri" w:cs="Calibri"/>
                 <w:sz w:val="20"/>
@@ -1037,55 +977,39 @@
                 <w:sz w:val="20"/>
                 <w:szCs w:val="20"/>
               </w:rPr>
-              <w:t xml:space="preserve">Augmented Reality Home Planner: Used Apple ARKit to develop an app for a furniture store enabling </w:t>
-            </w:r>
-            <w:r>
-              <w:rPr>
-                <w:rFonts w:ascii="Calibri" w:hAnsi="Calibri" w:cs="Calibri"/>
-                <w:sz w:val="20"/>
-                <w:szCs w:val="20"/>
-              </w:rPr>
-              <w:t>users</w:t>
-            </w:r>
-            <w:r>
-              <w:rPr>
-                <w:rFonts w:ascii="Calibri" w:hAnsi="Calibri" w:cs="Calibri"/>
-                <w:sz w:val="20"/>
-                <w:szCs w:val="20"/>
-              </w:rPr>
-              <w:t xml:space="preserve"> to place virtual 3D models of various items in their </w:t>
-            </w:r>
-            <w:r>
-              <w:rPr>
-                <w:rFonts w:ascii="Calibri" w:hAnsi="Calibri" w:cs="Calibri"/>
-                <w:sz w:val="20"/>
-                <w:szCs w:val="20"/>
-              </w:rPr>
-              <w:t>space</w:t>
-            </w:r>
-            <w:r>
-              <w:rPr>
-                <w:rFonts w:ascii="Calibri" w:hAnsi="Calibri" w:cs="Calibri"/>
-                <w:sz w:val="20"/>
-                <w:szCs w:val="20"/>
-              </w:rPr>
-              <w:t xml:space="preserve"> to see how </w:t>
-            </w:r>
-            <w:r>
-              <w:rPr>
-                <w:rFonts w:ascii="Calibri" w:hAnsi="Calibri" w:cs="Calibri"/>
-                <w:sz w:val="20"/>
-                <w:szCs w:val="20"/>
-              </w:rPr>
-              <w:t>they</w:t>
-            </w:r>
-            <w:r>
-              <w:rPr>
-                <w:rFonts w:ascii="Calibri" w:hAnsi="Calibri" w:cs="Calibri"/>
-                <w:sz w:val="20"/>
-                <w:szCs w:val="20"/>
-              </w:rPr>
-              <w:t xml:space="preserve"> would look and make better decisions.</w:t>
+              <w:t xml:space="preserve">Augmented Reality Home Planner: Used Apple ARKit to develop an </w:t>
+            </w:r>
+            <w:r>
+              <w:rPr>
+                <w:rFonts w:ascii="Calibri" w:hAnsi="Calibri" w:cs="Calibri"/>
+                <w:sz w:val="20"/>
+                <w:szCs w:val="20"/>
+              </w:rPr>
+              <w:t xml:space="preserve">iOS </w:t>
+            </w:r>
+            <w:r>
+              <w:rPr>
+                <w:rFonts w:ascii="Calibri" w:hAnsi="Calibri" w:cs="Calibri"/>
+                <w:sz w:val="20"/>
+                <w:szCs w:val="20"/>
+              </w:rPr>
+              <w:t xml:space="preserve">app for a furniture store enabling users to place virtual 3D models of various items in their space to see how they would look and make </w:t>
+            </w:r>
+            <w:r>
+              <w:rPr>
+                <w:rFonts w:ascii="Calibri" w:hAnsi="Calibri" w:cs="Calibri"/>
+                <w:sz w:val="20"/>
+                <w:szCs w:val="20"/>
+              </w:rPr>
+              <w:t>informed</w:t>
+            </w:r>
+            <w:r>
+              <w:rPr>
+                <w:rFonts w:ascii="Calibri" w:hAnsi="Calibri" w:cs="Calibri"/>
+                <w:sz w:val="20"/>
+                <w:szCs w:val="20"/>
+              </w:rPr>
+              <w:t xml:space="preserve"> decisions.</w:t>
             </w:r>
           </w:p>
           <w:p>
@@ -1098,6 +1022,7 @@
                 <w:tab w:val="clear" w:pos="720"/>
               </w:tabs>
               <w:ind w:left="252" w:hanging="180"/>
+              <w:jc w:val="both"/>
               <w:rPr>
                 <w:rFonts w:ascii="Calibri" w:hAnsi="Calibri" w:cs="Calibri"/>
                 <w:sz w:val="20"/>
@@ -1118,103 +1043,15 @@
                 <w:sz w:val="20"/>
                 <w:szCs w:val="20"/>
               </w:rPr>
-              <w:t>E</w:t>
-            </w:r>
-            <w:r>
-              <w:rPr>
-                <w:rFonts w:ascii="Calibri" w:hAnsi="Calibri" w:cs="Calibri"/>
-                <w:sz w:val="20"/>
-                <w:szCs w:val="20"/>
-              </w:rPr>
-              <w:t>nabl</w:t>
-            </w:r>
-            <w:r>
-              <w:rPr>
-                <w:rFonts w:ascii="Calibri" w:hAnsi="Calibri" w:cs="Calibri"/>
-                <w:sz w:val="20"/>
-                <w:szCs w:val="20"/>
-              </w:rPr>
-              <w:t>ed</w:t>
-            </w:r>
-            <w:r>
-              <w:rPr>
-                <w:rFonts w:ascii="Calibri" w:hAnsi="Calibri" w:cs="Calibri"/>
-                <w:sz w:val="20"/>
-                <w:szCs w:val="20"/>
-              </w:rPr>
-              <w:t xml:space="preserve"> GPS tracking</w:t>
-            </w:r>
-            <w:r>
-              <w:rPr>
-                <w:rFonts w:ascii="Calibri" w:hAnsi="Calibri" w:cs="Calibri"/>
-                <w:sz w:val="20"/>
-                <w:szCs w:val="20"/>
-              </w:rPr>
-              <w:t xml:space="preserve"> in a food delivery app</w:t>
-            </w:r>
-            <w:r>
-              <w:rPr>
-                <w:rFonts w:ascii="Calibri" w:hAnsi="Calibri" w:cs="Calibri"/>
-                <w:sz w:val="20"/>
-                <w:szCs w:val="20"/>
-              </w:rPr>
-              <w:t xml:space="preserve"> </w:t>
-            </w:r>
-            <w:r>
-              <w:rPr>
-                <w:rFonts w:ascii="Calibri" w:hAnsi="Calibri" w:cs="Calibri"/>
-                <w:sz w:val="20"/>
-                <w:szCs w:val="20"/>
-              </w:rPr>
-              <w:t>using Core Location</w:t>
-            </w:r>
-            <w:r>
-              <w:rPr>
-                <w:rFonts w:ascii="Calibri" w:hAnsi="Calibri" w:cs="Calibri"/>
-                <w:sz w:val="20"/>
-                <w:szCs w:val="20"/>
-              </w:rPr>
-              <w:t xml:space="preserve">, </w:t>
-            </w:r>
-            <w:r>
-              <w:rPr>
-                <w:rFonts w:ascii="Calibri" w:hAnsi="Calibri" w:cs="Calibri"/>
-                <w:sz w:val="20"/>
-                <w:szCs w:val="20"/>
-              </w:rPr>
-              <w:t>in addition to</w:t>
-            </w:r>
-            <w:r>
-              <w:rPr>
-                <w:rFonts w:ascii="Calibri" w:hAnsi="Calibri" w:cs="Calibri"/>
-                <w:sz w:val="20"/>
-                <w:szCs w:val="20"/>
-              </w:rPr>
-              <w:t xml:space="preserve"> </w:t>
-            </w:r>
-            <w:r>
-              <w:rPr>
-                <w:rFonts w:ascii="Calibri" w:hAnsi="Calibri" w:cs="Calibri"/>
-                <w:sz w:val="20"/>
-                <w:szCs w:val="20"/>
-              </w:rPr>
-              <w:t xml:space="preserve">finding and displaying the </w:t>
-            </w:r>
-            <w:r>
-              <w:rPr>
-                <w:rFonts w:ascii="Calibri" w:hAnsi="Calibri" w:cs="Calibri"/>
-                <w:sz w:val="20"/>
-                <w:szCs w:val="20"/>
-              </w:rPr>
-              <w:t>optimal route between pickup and drop locations</w:t>
-            </w:r>
-            <w:r>
-              <w:rPr>
-                <w:rFonts w:ascii="Calibri" w:hAnsi="Calibri" w:cs="Calibri"/>
-                <w:sz w:val="20"/>
-                <w:szCs w:val="20"/>
-              </w:rPr>
-              <w:t xml:space="preserve"> using the Directions API.</w:t>
+              <w:t>Implemented</w:t>
+            </w:r>
+            <w:r>
+              <w:rPr>
+                <w:rFonts w:ascii="Calibri" w:hAnsi="Calibri" w:cs="Calibri"/>
+                <w:sz w:val="20"/>
+                <w:szCs w:val="20"/>
+              </w:rPr>
+              <w:t xml:space="preserve"> GPS tracking in a food delivery app using Core Location, in addition to finding and displaying the optimal route between pickup and drop locations using the Directions API.</w:t>
             </w:r>
           </w:p>
           <w:p>
@@ -1231,12 +1068,12 @@
       </w:tr>
       <w:tr>
         <w:trPr>
-          <w:trHeight w:val="266"/>
+          <w:trHeight w:val="264"/>
         </w:trPr>
         <w:tc>
           <w:tcPr>
             <w:tcW w:w="5000" w:type="pct"/>
-            <w:gridSpan w:val="7"/>
+            <w:gridSpan w:val="9"/>
             <w:tcBorders>
               <w:bottom w:val="single" w:sz="4" w:space="0" w:color="auto"/>
             </w:tcBorders>
@@ -1259,19 +1096,747 @@
                 <w:sz w:val="20"/>
                 <w:szCs w:val="20"/>
               </w:rPr>
-              <w:t>Projects</w:t>
+              <w:t>Education</w:t>
             </w:r>
           </w:p>
         </w:tc>
       </w:tr>
       <w:tr>
         <w:trPr>
-          <w:trHeight w:val="3164"/>
+          <w:trHeight w:val="58"/>
+        </w:trPr>
+        <w:tc>
+          <w:tcPr>
+            <w:tcW w:w="1662" w:type="pct"/>
+            <w:gridSpan w:val="3"/>
+            <w:shd w:val="clear" w:color="auto" w:fill="auto"/>
+          </w:tcPr>
+          <w:p>
+            <w:pPr>
+              <w:rPr>
+                <w:rFonts w:ascii="Calibri" w:hAnsi="Calibri" w:cs="Calibri"/>
+                <w:b/>
+                <w:bCs/>
+                <w:i/>
+                <w:iCs/>
+                <w:sz w:val="20"/>
+                <w:szCs w:val="20"/>
+              </w:rPr>
+            </w:pPr>
+            <w:r>
+              <w:rPr>
+                <w:rFonts w:ascii="Calibri" w:hAnsi="Calibri" w:cs="Calibri"/>
+                <w:b/>
+                <w:bCs/>
+                <w:i/>
+                <w:iCs/>
+                <w:sz w:val="20"/>
+                <w:szCs w:val="20"/>
+              </w:rPr>
+              <w:t>Master’s Degree</w:t>
+            </w:r>
+            <w:r>
+              <w:rPr>
+                <w:rFonts w:ascii="Calibri" w:hAnsi="Calibri" w:cs="Calibri"/>
+                <w:b/>
+                <w:bCs/>
+                <w:i/>
+                <w:iCs/>
+                <w:sz w:val="20"/>
+                <w:szCs w:val="20"/>
+              </w:rPr>
+              <w:t xml:space="preserve"> (ongoing)</w:t>
+            </w:r>
+          </w:p>
+        </w:tc>
+        <w:tc>
+          <w:tcPr>
+            <w:tcW w:w="1426" w:type="pct"/>
+            <w:gridSpan w:val="2"/>
+            <w:shd w:val="clear" w:color="auto" w:fill="auto"/>
+          </w:tcPr>
+          <w:p>
+            <w:pPr>
+              <w:ind w:left="252"/>
+              <w:jc w:val="center"/>
+              <w:rPr>
+                <w:rFonts w:ascii="Calibri" w:hAnsi="Calibri" w:cs="Calibri"/>
+                <w:b/>
+                <w:bCs/>
+                <w:i/>
+                <w:iCs/>
+                <w:sz w:val="20"/>
+                <w:szCs w:val="20"/>
+              </w:rPr>
+            </w:pPr>
+            <w:r>
+              <w:rPr>
+                <w:rFonts w:ascii="Calibri" w:hAnsi="Calibri" w:cs="Calibri"/>
+                <w:b/>
+                <w:bCs/>
+                <w:i/>
+                <w:iCs/>
+                <w:sz w:val="20"/>
+                <w:szCs w:val="20"/>
+              </w:rPr>
+              <w:t>BITS, Pilani</w:t>
+            </w:r>
+          </w:p>
+        </w:tc>
+        <w:tc>
+          <w:tcPr>
+            <w:tcW w:w="1912" w:type="pct"/>
+            <w:gridSpan w:val="4"/>
+            <w:shd w:val="clear" w:color="auto" w:fill="auto"/>
+          </w:tcPr>
+          <w:p>
+            <w:pPr>
+              <w:ind w:left="252"/>
+              <w:jc w:val="right"/>
+              <w:rPr>
+                <w:rFonts w:ascii="Calibri" w:hAnsi="Calibri" w:cs="Calibri"/>
+                <w:b/>
+                <w:bCs/>
+                <w:i/>
+                <w:iCs/>
+                <w:sz w:val="20"/>
+                <w:szCs w:val="20"/>
+              </w:rPr>
+            </w:pPr>
+            <w:r>
+              <w:rPr>
+                <w:rFonts w:ascii="Calibri" w:hAnsi="Calibri" w:cs="Calibri"/>
+                <w:b/>
+                <w:bCs/>
+                <w:i/>
+                <w:iCs/>
+                <w:sz w:val="20"/>
+                <w:szCs w:val="20"/>
+              </w:rPr>
+              <w:t>Jan 2023 – Dec 2024 (exp.)</w:t>
+            </w:r>
+          </w:p>
+        </w:tc>
+      </w:tr>
+      <w:tr>
+        <w:trPr>
+          <w:trHeight w:val="58"/>
         </w:trPr>
         <w:tc>
           <w:tcPr>
             <w:tcW w:w="5000" w:type="pct"/>
+            <w:gridSpan w:val="9"/>
+            <w:shd w:val="clear" w:color="auto" w:fill="auto"/>
+          </w:tcPr>
+          <w:p>
+            <w:pPr>
+              <w:numPr>
+                <w:ilvl w:val="0"/>
+                <w:numId w:val="5"/>
+              </w:numPr>
+              <w:tabs>
+                <w:tab w:val="clear" w:pos="720"/>
+              </w:tabs>
+              <w:ind w:left="252" w:hanging="180"/>
+              <w:rPr>
+                <w:rFonts w:ascii="Calibri" w:hAnsi="Calibri" w:cs="Calibri"/>
+                <w:sz w:val="20"/>
+                <w:szCs w:val="20"/>
+              </w:rPr>
+            </w:pPr>
+            <w:r>
+              <w:rPr>
+                <w:rFonts w:ascii="Calibri" w:hAnsi="Calibri" w:cs="Calibri"/>
+                <w:sz w:val="20"/>
+                <w:szCs w:val="20"/>
+              </w:rPr>
+              <w:t>Master of Technology</w:t>
+            </w:r>
+            <w:r>
+              <w:rPr>
+                <w:rFonts w:ascii="Calibri" w:hAnsi="Calibri" w:cs="Calibri"/>
+                <w:sz w:val="20"/>
+                <w:szCs w:val="20"/>
+              </w:rPr>
+              <w:t xml:space="preserve"> (</w:t>
+            </w:r>
+            <w:r>
+              <w:rPr>
+                <w:rFonts w:ascii="Calibri" w:hAnsi="Calibri" w:cs="Calibri"/>
+                <w:sz w:val="20"/>
+                <w:szCs w:val="20"/>
+              </w:rPr>
+              <w:t>M.Tech.</w:t>
+            </w:r>
+            <w:r>
+              <w:rPr>
+                <w:rFonts w:ascii="Calibri" w:hAnsi="Calibri" w:cs="Calibri"/>
+                <w:sz w:val="20"/>
+                <w:szCs w:val="20"/>
+              </w:rPr>
+              <w:t xml:space="preserve">) in </w:t>
+            </w:r>
+            <w:r>
+              <w:rPr>
+                <w:rFonts w:ascii="Calibri" w:hAnsi="Calibri" w:cs="Calibri"/>
+                <w:sz w:val="20"/>
+                <w:szCs w:val="20"/>
+              </w:rPr>
+              <w:t>Software Engineering with current CGPA 9.44</w:t>
+            </w:r>
+          </w:p>
+          <w:p>
+            <w:pPr>
+              <w:ind w:left="252"/>
+              <w:rPr>
+                <w:rFonts w:ascii="Calibri" w:hAnsi="Calibri" w:cs="Calibri"/>
+                <w:sz w:val="20"/>
+                <w:szCs w:val="20"/>
+              </w:rPr>
+            </w:pPr>
+          </w:p>
+        </w:tc>
+      </w:tr>
+      <w:tr>
+        <w:trPr>
+          <w:trHeight w:val="258"/>
+        </w:trPr>
+        <w:tc>
+          <w:tcPr>
+            <w:tcW w:w="994" w:type="pct"/>
+            <w:shd w:val="clear" w:color="auto" w:fill="auto"/>
+          </w:tcPr>
+          <w:p>
+            <w:pPr>
+              <w:rPr>
+                <w:rFonts w:ascii="Calibri" w:hAnsi="Calibri" w:cs="Calibri"/>
+                <w:b/>
+                <w:i/>
+                <w:iCs/>
+                <w:sz w:val="20"/>
+                <w:szCs w:val="20"/>
+              </w:rPr>
+            </w:pPr>
+            <w:r>
+              <w:rPr>
+                <w:rFonts w:ascii="Calibri" w:hAnsi="Calibri" w:cs="Calibri"/>
+                <w:b/>
+                <w:i/>
+                <w:iCs/>
+                <w:sz w:val="20"/>
+                <w:szCs w:val="20"/>
+              </w:rPr>
+              <w:t>Bachelor’s Degree</w:t>
+            </w:r>
+          </w:p>
+        </w:tc>
+        <w:tc>
+          <w:tcPr>
+            <w:tcW w:w="2974" w:type="pct"/>
             <w:gridSpan w:val="7"/>
+            <w:shd w:val="clear" w:color="auto" w:fill="auto"/>
+          </w:tcPr>
+          <w:p>
+            <w:pPr>
+              <w:ind w:left="72"/>
+              <w:jc w:val="center"/>
+              <w:rPr>
+                <w:rFonts w:ascii="Calibri" w:hAnsi="Calibri" w:cs="Calibri"/>
+                <w:b/>
+                <w:i/>
+                <w:iCs/>
+                <w:sz w:val="20"/>
+                <w:szCs w:val="20"/>
+              </w:rPr>
+            </w:pPr>
+            <w:r>
+              <w:rPr>
+                <w:rFonts w:ascii="Calibri" w:hAnsi="Calibri" w:cs="Calibri"/>
+                <w:b/>
+                <w:i/>
+                <w:iCs/>
+                <w:sz w:val="20"/>
+                <w:szCs w:val="20"/>
+              </w:rPr>
+              <w:t>Panjab University</w:t>
+            </w:r>
+            <w:r>
+              <w:rPr>
+                <w:rFonts w:ascii="Calibri" w:hAnsi="Calibri" w:cs="Calibri"/>
+                <w:b/>
+                <w:i/>
+                <w:iCs/>
+                <w:sz w:val="20"/>
+                <w:szCs w:val="20"/>
+              </w:rPr>
+              <w:t>, Chandigarh</w:t>
+            </w:r>
+          </w:p>
+        </w:tc>
+        <w:tc>
+          <w:tcPr>
+            <w:tcW w:w="1032" w:type="pct"/>
+            <w:shd w:val="clear" w:color="auto" w:fill="auto"/>
+          </w:tcPr>
+          <w:p>
+            <w:pPr>
+              <w:jc w:val="right"/>
+              <w:rPr>
+                <w:rFonts w:ascii="Calibri" w:hAnsi="Calibri" w:cs="Calibri"/>
+                <w:b/>
+                <w:i/>
+                <w:iCs/>
+                <w:sz w:val="20"/>
+                <w:szCs w:val="20"/>
+              </w:rPr>
+            </w:pPr>
+            <w:r>
+              <w:rPr>
+                <w:rFonts w:ascii="Calibri" w:hAnsi="Calibri" w:cs="Calibri"/>
+                <w:b/>
+                <w:i/>
+                <w:iCs/>
+                <w:sz w:val="20"/>
+                <w:szCs w:val="20"/>
+              </w:rPr>
+              <w:t>Jul 2017 – Jun 2021</w:t>
+            </w:r>
+          </w:p>
+        </w:tc>
+      </w:tr>
+      <w:tr>
+        <w:trPr>
+          <w:trHeight w:val="58"/>
+        </w:trPr>
+        <w:tc>
+          <w:tcPr>
+            <w:tcW w:w="5000" w:type="pct"/>
+            <w:gridSpan w:val="9"/>
+            <w:shd w:val="clear" w:color="auto" w:fill="auto"/>
+          </w:tcPr>
+          <w:p>
+            <w:pPr>
+              <w:numPr>
+                <w:ilvl w:val="0"/>
+                <w:numId w:val="5"/>
+              </w:numPr>
+              <w:tabs>
+                <w:tab w:val="clear" w:pos="720"/>
+              </w:tabs>
+              <w:ind w:left="252" w:hanging="180"/>
+              <w:rPr>
+                <w:rFonts w:ascii="Calibri" w:hAnsi="Calibri" w:cs="Calibri"/>
+                <w:sz w:val="20"/>
+                <w:szCs w:val="20"/>
+              </w:rPr>
+            </w:pPr>
+            <w:bookmarkStart w:id="5" w:name="_Hlk144192934"/>
+            <w:r>
+              <w:rPr>
+                <w:rFonts w:ascii="Calibri" w:hAnsi="Calibri" w:cs="Calibri"/>
+                <w:sz w:val="20"/>
+                <w:szCs w:val="20"/>
+              </w:rPr>
+              <w:t>Bachelor of Engineering (B.E.) in Information Technology</w:t>
+            </w:r>
+            <w:r>
+              <w:rPr>
+                <w:rFonts w:ascii="Calibri" w:hAnsi="Calibri" w:cs="Calibri"/>
+                <w:sz w:val="20"/>
+                <w:szCs w:val="20"/>
+              </w:rPr>
+              <w:t xml:space="preserve"> (with Honors)</w:t>
+            </w:r>
+          </w:p>
+          <w:bookmarkEnd w:id="5"/>
+          <w:p>
+            <w:pPr>
+              <w:ind w:left="252"/>
+              <w:rPr>
+                <w:rFonts w:ascii="Calibri" w:hAnsi="Calibri" w:cs="Calibri"/>
+                <w:sz w:val="20"/>
+                <w:szCs w:val="20"/>
+              </w:rPr>
+            </w:pPr>
+          </w:p>
+        </w:tc>
+      </w:tr>
+      <w:tr>
+        <w:trPr>
+          <w:trHeight w:val="71"/>
+        </w:trPr>
+        <w:tc>
+          <w:tcPr>
+            <w:tcW w:w="5000" w:type="pct"/>
+            <w:gridSpan w:val="9"/>
+            <w:tcBorders>
+              <w:bottom w:val="single" w:sz="4" w:space="0" w:color="auto"/>
+            </w:tcBorders>
+            <w:shd w:val="clear" w:color="auto" w:fill="auto"/>
+          </w:tcPr>
+          <w:p>
+            <w:pPr>
+              <w:rPr>
+                <w:rFonts w:ascii="Calibri" w:hAnsi="Calibri" w:cs="Calibri"/>
+                <w:b/>
+                <w:bCs/>
+                <w:sz w:val="20"/>
+                <w:szCs w:val="20"/>
+              </w:rPr>
+            </w:pPr>
+            <w:r>
+              <w:rPr>
+                <w:rFonts w:ascii="Calibri" w:hAnsi="Calibri" w:cs="Calibri"/>
+                <w:b/>
+                <w:smallCaps/>
+                <w:sz w:val="20"/>
+                <w:szCs w:val="20"/>
+              </w:rPr>
+              <w:t>Achievements</w:t>
+            </w:r>
+          </w:p>
+        </w:tc>
+      </w:tr>
+      <w:tr>
+        <w:trPr>
+          <w:trHeight w:val="313"/>
+        </w:trPr>
+        <w:tc>
+          <w:tcPr>
+            <w:tcW w:w="5000" w:type="pct"/>
+            <w:gridSpan w:val="9"/>
+            <w:shd w:val="clear" w:color="auto" w:fill="auto"/>
+          </w:tcPr>
+          <w:p>
+            <w:pPr>
+              <w:numPr>
+                <w:ilvl w:val="0"/>
+                <w:numId w:val="5"/>
+              </w:numPr>
+              <w:tabs>
+                <w:tab w:val="clear" w:pos="720"/>
+              </w:tabs>
+              <w:ind w:left="252" w:hanging="180"/>
+              <w:rPr>
+                <w:rFonts w:ascii="Calibri" w:hAnsi="Calibri" w:cs="Calibri"/>
+                <w:sz w:val="20"/>
+                <w:szCs w:val="20"/>
+              </w:rPr>
+            </w:pPr>
+            <w:r>
+              <w:rPr>
+                <w:rFonts w:ascii="Calibri" w:hAnsi="Calibri" w:cs="Calibri"/>
+                <w:sz w:val="20"/>
+                <w:szCs w:val="20"/>
+              </w:rPr>
+              <w:t>Achieved 4* on CodeChef with a rating of 1902 (2022)</w:t>
+            </w:r>
+          </w:p>
+          <w:p>
+            <w:pPr>
+              <w:numPr>
+                <w:ilvl w:val="0"/>
+                <w:numId w:val="5"/>
+              </w:numPr>
+              <w:tabs>
+                <w:tab w:val="clear" w:pos="720"/>
+              </w:tabs>
+              <w:ind w:left="252" w:hanging="180"/>
+              <w:rPr>
+                <w:rFonts w:ascii="Calibri" w:hAnsi="Calibri" w:cs="Calibri"/>
+                <w:sz w:val="20"/>
+                <w:szCs w:val="20"/>
+              </w:rPr>
+            </w:pPr>
+            <w:r>
+              <w:rPr>
+                <w:rFonts w:ascii="Calibri" w:hAnsi="Calibri" w:cs="Calibri"/>
+                <w:sz w:val="20"/>
+                <w:szCs w:val="20"/>
+              </w:rPr>
+              <w:t>Completed the 6-month Deep Learning Nanodegree by Udacity and Facebook AI in 2019. Was also a</w:t>
+            </w:r>
+            <w:r>
+              <w:rPr>
+                <w:rFonts w:ascii="Calibri" w:hAnsi="Calibri" w:cs="Calibri"/>
+                <w:sz w:val="20"/>
+                <w:szCs w:val="20"/>
+              </w:rPr>
+              <w:t xml:space="preserve">warded full scholarship by Facebook with </w:t>
+            </w:r>
+            <w:r>
+              <w:rPr>
+                <w:rFonts w:ascii="Calibri" w:hAnsi="Calibri" w:cs="Calibri"/>
+                <w:sz w:val="20"/>
+                <w:szCs w:val="20"/>
+              </w:rPr>
+              <w:t xml:space="preserve">an </w:t>
+            </w:r>
+            <w:r>
+              <w:rPr>
+                <w:rFonts w:ascii="Calibri" w:hAnsi="Calibri" w:cs="Calibri"/>
+                <w:sz w:val="20"/>
+                <w:szCs w:val="20"/>
+              </w:rPr>
+              <w:t>acceptance rate of 3% out of 10,000 global applicants.</w:t>
+            </w:r>
+            <w:r>
+              <w:rPr>
+                <w:rFonts w:ascii="Calibri" w:hAnsi="Calibri" w:cs="Calibri"/>
+                <w:sz w:val="20"/>
+                <w:szCs w:val="20"/>
+              </w:rPr>
+              <w:t xml:space="preserve"> Credential ID: </w:t>
+            </w:r>
+            <w:hyperlink r:id="rId8" w:history="1">
+              <w:r>
+                <w:rPr>
+                  <w:rStyle w:val="Hyperlink"/>
+                  <w:rFonts w:ascii="Calibri" w:hAnsi="Calibri" w:cs="Calibri"/>
+                  <w:sz w:val="20"/>
+                  <w:szCs w:val="20"/>
+                </w:rPr>
+                <w:t>C9HLTFDN</w:t>
+              </w:r>
+            </w:hyperlink>
+            <w:r>
+              <w:rPr>
+                <w:rFonts w:ascii="Calibri" w:hAnsi="Calibri" w:cs="Calibri"/>
+                <w:sz w:val="20"/>
+                <w:szCs w:val="20"/>
+              </w:rPr>
+              <w:t xml:space="preserve"> </w:t>
+            </w:r>
+            <w:r>
+              <w:rPr>
+                <w:rFonts w:ascii="Calibri" w:hAnsi="Calibri" w:cs="Calibri"/>
+                <w:sz w:val="20"/>
+                <w:szCs w:val="20"/>
+              </w:rPr>
+              <w:br/>
+            </w:r>
+          </w:p>
+        </w:tc>
+      </w:tr>
+      <w:tr>
+        <w:trPr>
+          <w:trHeight w:val="71"/>
+        </w:trPr>
+        <w:tc>
+          <w:tcPr>
+            <w:tcW w:w="5000" w:type="pct"/>
+            <w:gridSpan w:val="9"/>
+            <w:tcBorders>
+              <w:bottom w:val="single" w:sz="4" w:space="0" w:color="auto"/>
+            </w:tcBorders>
+            <w:shd w:val="clear" w:color="auto" w:fill="auto"/>
+          </w:tcPr>
+          <w:p>
+            <w:pPr>
+              <w:rPr>
+                <w:rFonts w:ascii="Calibri" w:hAnsi="Calibri" w:cs="Calibri"/>
+                <w:sz w:val="20"/>
+                <w:szCs w:val="20"/>
+              </w:rPr>
+            </w:pPr>
+            <w:r>
+              <w:rPr>
+                <w:rFonts w:ascii="Calibri" w:hAnsi="Calibri" w:cs="Calibri"/>
+                <w:b/>
+                <w:smallCaps/>
+                <w:sz w:val="20"/>
+                <w:szCs w:val="20"/>
+              </w:rPr>
+              <w:t>Skills &amp; Technologies</w:t>
+            </w:r>
+            <w:r>
+              <w:rPr>
+                <w:rFonts w:ascii="Calibri" w:hAnsi="Calibri" w:cs="Calibri"/>
+                <w:b/>
+                <w:sz w:val="20"/>
+                <w:szCs w:val="20"/>
+              </w:rPr>
+              <w:t xml:space="preserve"> </w:t>
+            </w:r>
+          </w:p>
+        </w:tc>
+      </w:tr>
+      <w:tr>
+        <w:trPr>
+          <w:trHeight w:val="71"/>
+        </w:trPr>
+        <w:tc>
+          <w:tcPr>
+            <w:tcW w:w="5000" w:type="pct"/>
+            <w:gridSpan w:val="9"/>
+            <w:tcBorders>
+              <w:top w:val="single" w:sz="4" w:space="0" w:color="auto"/>
+            </w:tcBorders>
+            <w:shd w:val="clear" w:color="auto" w:fill="auto"/>
+          </w:tcPr>
+          <w:p>
+            <w:pPr>
+              <w:pStyle w:val="Achievement"/>
+              <w:rPr>
+                <w:rFonts w:ascii="Calibri" w:hAnsi="Calibri" w:cs="Calibri"/>
+              </w:rPr>
+            </w:pPr>
+            <w:r>
+              <w:rPr>
+                <w:rFonts w:ascii="Calibri" w:hAnsi="Calibri" w:cs="Calibri"/>
+              </w:rPr>
+              <w:t>C++</w:t>
+            </w:r>
+            <w:r>
+              <w:rPr>
+                <w:rFonts w:ascii="Calibri" w:hAnsi="Calibri" w:cs="Calibri"/>
+              </w:rPr>
+              <w:t xml:space="preserve">, </w:t>
+            </w:r>
+            <w:r>
+              <w:rPr>
+                <w:rFonts w:ascii="Calibri" w:hAnsi="Calibri" w:cs="Calibri"/>
+              </w:rPr>
+              <w:t xml:space="preserve">Python, Swift, </w:t>
+            </w:r>
+            <w:r>
+              <w:rPr>
+                <w:rFonts w:ascii="Calibri" w:hAnsi="Calibri" w:cs="Calibri"/>
+              </w:rPr>
+              <w:t xml:space="preserve">Java, </w:t>
+            </w:r>
+            <w:r>
+              <w:rPr>
+                <w:rFonts w:ascii="Calibri" w:hAnsi="Calibri" w:cs="Calibri"/>
+              </w:rPr>
+              <w:t>Bash, SQL, Hive</w:t>
+            </w:r>
+          </w:p>
+          <w:p>
+            <w:pPr>
+              <w:pStyle w:val="Achievement"/>
+              <w:rPr>
+                <w:rFonts w:ascii="Calibri" w:hAnsi="Calibri" w:cs="Calibri"/>
+              </w:rPr>
+            </w:pPr>
+            <w:r>
+              <w:rPr>
+                <w:rFonts w:ascii="Calibri" w:hAnsi="Calibri" w:cs="Calibri"/>
+              </w:rPr>
+              <w:t>Git</w:t>
+            </w:r>
+            <w:r>
+              <w:rPr>
+                <w:rFonts w:ascii="Calibri" w:hAnsi="Calibri" w:cs="Calibri"/>
+              </w:rPr>
+              <w:t xml:space="preserve"> CLI</w:t>
+            </w:r>
+            <w:r>
+              <w:rPr>
+                <w:rFonts w:ascii="Calibri" w:hAnsi="Calibri" w:cs="Calibri"/>
+              </w:rPr>
+              <w:t xml:space="preserve">, </w:t>
+            </w:r>
+            <w:r>
+              <w:rPr>
+                <w:rFonts w:ascii="Calibri" w:hAnsi="Calibri" w:cs="Calibri"/>
+              </w:rPr>
+              <w:t>Jenkins, XLR</w:t>
+            </w:r>
+            <w:r>
+              <w:rPr>
+                <w:rFonts w:ascii="Calibri" w:hAnsi="Calibri" w:cs="Calibri"/>
+              </w:rPr>
+              <w:t>, Docker</w:t>
+            </w:r>
+            <w:r>
+              <w:rPr>
+                <w:rFonts w:ascii="Calibri" w:hAnsi="Calibri" w:cs="Calibri"/>
+              </w:rPr>
+              <w:t xml:space="preserve">, </w:t>
+            </w:r>
+            <w:r>
+              <w:rPr>
+                <w:rFonts w:ascii="Calibri" w:hAnsi="Calibri" w:cs="Calibri"/>
+              </w:rPr>
+              <w:t>Kubernetes, TensorFlow, PyTorch, Xcode</w:t>
+            </w:r>
+          </w:p>
+          <w:p>
+            <w:pPr>
+              <w:pStyle w:val="Achievement"/>
+              <w:rPr>
+                <w:rFonts w:ascii="Calibri" w:hAnsi="Calibri" w:cs="Calibri"/>
+              </w:rPr>
+            </w:pPr>
+            <w:r>
+              <w:rPr>
+                <w:rFonts w:ascii="Calibri" w:hAnsi="Calibri" w:cs="Calibri"/>
+              </w:rPr>
+              <w:t>Backend Web Development, iOS App Development, Machine Learning</w:t>
+            </w:r>
+            <w:r>
+              <w:rPr>
+                <w:rFonts w:ascii="Calibri" w:hAnsi="Calibri" w:cs="Calibri"/>
+              </w:rPr>
+              <w:t>, Data Structures &amp; Algorithms</w:t>
+            </w:r>
+          </w:p>
+          <w:p>
+            <w:pPr>
+              <w:ind w:left="252"/>
+              <w:rPr>
+                <w:rFonts w:ascii="Calibri" w:hAnsi="Calibri" w:cs="Calibri"/>
+                <w:sz w:val="20"/>
+                <w:szCs w:val="20"/>
+              </w:rPr>
+            </w:pPr>
+          </w:p>
+        </w:tc>
+      </w:tr>
+      <w:tr>
+        <w:trPr>
+          <w:trHeight w:val="264"/>
+        </w:trPr>
+        <w:tc>
+          <w:tcPr>
+            <w:tcW w:w="5000" w:type="pct"/>
+            <w:gridSpan w:val="9"/>
+            <w:tcBorders>
+              <w:bottom w:val="single" w:sz="4" w:space="0" w:color="auto"/>
+            </w:tcBorders>
+            <w:shd w:val="clear" w:color="auto" w:fill="auto"/>
+          </w:tcPr>
+          <w:p>
+            <w:pPr>
+              <w:rPr>
+                <w:rFonts w:ascii="Calibri" w:hAnsi="Calibri" w:cs="Calibri"/>
+                <w:smallCaps/>
+                <w:sz w:val="20"/>
+                <w:szCs w:val="20"/>
+              </w:rPr>
+            </w:pPr>
+            <w:r>
+              <w:rPr>
+                <w:rFonts w:ascii="Calibri" w:hAnsi="Calibri" w:cs="Calibri"/>
+                <w:b/>
+                <w:smallCaps/>
+                <w:sz w:val="20"/>
+                <w:szCs w:val="20"/>
+              </w:rPr>
+              <w:t>Projects</w:t>
+            </w:r>
+          </w:p>
+        </w:tc>
+      </w:tr>
+      <w:tr>
+        <w:trPr>
+          <w:trHeight w:val="3160"/>
+        </w:trPr>
+        <w:tc>
+          <w:tcPr>
+            <w:tcW w:w="5000" w:type="pct"/>
+            <w:gridSpan w:val="9"/>
             <w:shd w:val="clear" w:color="auto" w:fill="auto"/>
           </w:tcPr>
           <w:p>
@@ -1284,6 +1849,7 @@
                 <w:tab w:val="clear" w:pos="916"/>
               </w:tabs>
               <w:ind w:left="252" w:hanging="180"/>
+              <w:jc w:val="both"/>
               <w:rPr>
                 <w:rFonts w:ascii="Calibri" w:hAnsi="Calibri" w:cs="Calibri"/>
                 <w:sz w:val="20"/>
@@ -1297,25 +1863,7 @@
                 <w:sz w:val="20"/>
                 <w:szCs w:val="20"/>
               </w:rPr>
-              <w:t>[Computer Vision] Cosmic Art</w:t>
-            </w:r>
-            <w:r>
-              <w:rPr>
-                <w:rFonts w:ascii="Calibri" w:hAnsi="Calibri" w:cs="Calibri"/>
-                <w:b/>
-                <w:sz w:val="20"/>
-                <w:szCs w:val="20"/>
-              </w:rPr>
-              <w:t>i</w:t>
-            </w:r>
-            <w:r>
-              <w:rPr>
-                <w:rFonts w:ascii="Calibri" w:hAnsi="Calibri" w:cs="Calibri"/>
-                <w:b/>
-                <w:sz w:val="20"/>
-                <w:szCs w:val="20"/>
-              </w:rPr>
-              <w:t xml:space="preserve">fact Filter: </w:t>
+              <w:t xml:space="preserve">Cosmic Artifact Filter: </w:t>
             </w:r>
             <w:r>
               <w:rPr>
@@ -1324,43 +1872,7 @@
                 <w:sz w:val="20"/>
                 <w:szCs w:val="20"/>
               </w:rPr>
-              <w:t>Trained a deep learning model to flag cosmic ray art</w:t>
-            </w:r>
-            <w:r>
-              <w:rPr>
-                <w:rFonts w:ascii="Calibri" w:hAnsi="Calibri" w:cs="Calibri"/>
-                <w:bCs/>
-                <w:sz w:val="20"/>
-                <w:szCs w:val="20"/>
-              </w:rPr>
-              <w:t>i</w:t>
-            </w:r>
-            <w:r>
-              <w:rPr>
-                <w:rFonts w:ascii="Calibri" w:hAnsi="Calibri" w:cs="Calibri"/>
-                <w:bCs/>
-                <w:sz w:val="20"/>
-                <w:szCs w:val="20"/>
-              </w:rPr>
-              <w:t>facts in satellite imagery for deeper analysis</w:t>
-            </w:r>
-            <w:r>
-              <w:rPr>
-                <w:rFonts w:ascii="Calibri" w:hAnsi="Calibri" w:cs="Calibri"/>
-                <w:bCs/>
-                <w:sz w:val="20"/>
-                <w:szCs w:val="20"/>
-              </w:rPr>
-              <w:t xml:space="preserve"> using </w:t>
-            </w:r>
-            <w:r>
-              <w:rPr>
-                <w:rFonts w:ascii="Calibri" w:hAnsi="Calibri" w:cs="Calibri"/>
-                <w:bCs/>
-                <w:sz w:val="20"/>
-                <w:szCs w:val="20"/>
-              </w:rPr>
-              <w:t>image data from NASA’s MESSENGER Spacecraft orbiting the planet Mercury.</w:t>
+              <w:t>Trained a deep learning model to flag cosmic ray artifacts in satellite imagery for deeper analysis using image data from NASA’s MESSENGER Spacecraft orbiting the planet Mercury.</w:t>
             </w:r>
           </w:p>
           <w:p>
@@ -1373,6 +1885,7 @@
                 <w:tab w:val="clear" w:pos="916"/>
               </w:tabs>
               <w:ind w:left="252" w:hanging="180"/>
+              <w:jc w:val="both"/>
               <w:rPr>
                 <w:rFonts w:ascii="Calibri" w:hAnsi="Calibri" w:cs="Calibri"/>
                 <w:sz w:val="20"/>
@@ -1386,7 +1899,7 @@
                 <w:sz w:val="20"/>
                 <w:szCs w:val="20"/>
               </w:rPr>
-              <w:t xml:space="preserve">[Computer Vision] Dark Matter Discovery: </w:t>
+              <w:t xml:space="preserve">Dark Matter Discovery: </w:t>
             </w:r>
             <w:r>
               <w:rPr>
@@ -1395,97 +1908,7 @@
                 <w:sz w:val="20"/>
                 <w:szCs w:val="20"/>
               </w:rPr>
-              <w:t xml:space="preserve">Built a pipeline to visualize and confirm </w:t>
-            </w:r>
-            <w:r>
-              <w:rPr>
-                <w:rFonts w:ascii="Calibri" w:hAnsi="Calibri" w:cs="Calibri"/>
-                <w:bCs/>
-                <w:sz w:val="20"/>
-                <w:szCs w:val="20"/>
-              </w:rPr>
-              <w:t xml:space="preserve">the </w:t>
-            </w:r>
-            <w:r>
-              <w:rPr>
-                <w:rFonts w:ascii="Calibri" w:hAnsi="Calibri" w:cs="Calibri"/>
-                <w:bCs/>
-                <w:sz w:val="20"/>
-                <w:szCs w:val="20"/>
-              </w:rPr>
-              <w:t xml:space="preserve">presence of </w:t>
-            </w:r>
-            <w:r>
-              <w:rPr>
-                <w:rFonts w:ascii="Calibri" w:hAnsi="Calibri" w:cs="Calibri"/>
-                <w:bCs/>
-                <w:sz w:val="20"/>
-                <w:szCs w:val="20"/>
-              </w:rPr>
-              <w:t>d</w:t>
-            </w:r>
-            <w:r>
-              <w:rPr>
-                <w:rFonts w:ascii="Calibri" w:hAnsi="Calibri" w:cs="Calibri"/>
-                <w:bCs/>
-                <w:sz w:val="20"/>
-                <w:szCs w:val="20"/>
-              </w:rPr>
-              <w:t xml:space="preserve">ark </w:t>
-            </w:r>
-            <w:r>
-              <w:rPr>
-                <w:rFonts w:ascii="Calibri" w:hAnsi="Calibri" w:cs="Calibri"/>
-                <w:bCs/>
-                <w:sz w:val="20"/>
-                <w:szCs w:val="20"/>
-              </w:rPr>
-              <w:t>m</w:t>
-            </w:r>
-            <w:r>
-              <w:rPr>
-                <w:rFonts w:ascii="Calibri" w:hAnsi="Calibri" w:cs="Calibri"/>
-                <w:bCs/>
-                <w:sz w:val="20"/>
-                <w:szCs w:val="20"/>
-              </w:rPr>
-              <w:t xml:space="preserve">atter in </w:t>
-            </w:r>
-            <w:r>
-              <w:rPr>
-                <w:rFonts w:ascii="Calibri" w:hAnsi="Calibri" w:cs="Calibri"/>
-                <w:bCs/>
-                <w:sz w:val="20"/>
-                <w:szCs w:val="20"/>
-              </w:rPr>
-              <w:t>c</w:t>
-            </w:r>
-            <w:r>
-              <w:rPr>
-                <w:rFonts w:ascii="Calibri" w:hAnsi="Calibri" w:cs="Calibri"/>
-                <w:bCs/>
-                <w:sz w:val="20"/>
-                <w:szCs w:val="20"/>
-              </w:rPr>
-              <w:t xml:space="preserve">osmic </w:t>
-            </w:r>
-            <w:r>
-              <w:rPr>
-                <w:rFonts w:ascii="Calibri" w:hAnsi="Calibri" w:cs="Calibri"/>
-                <w:bCs/>
-                <w:sz w:val="20"/>
-                <w:szCs w:val="20"/>
-              </w:rPr>
-              <w:t>d</w:t>
-            </w:r>
-            <w:r>
-              <w:rPr>
-                <w:rFonts w:ascii="Calibri" w:hAnsi="Calibri" w:cs="Calibri"/>
-                <w:bCs/>
-                <w:sz w:val="20"/>
-                <w:szCs w:val="20"/>
-              </w:rPr>
-              <w:t>ata based on the principle of Strong Gravitational Lensing, using PyAutoLens.</w:t>
+              <w:t>Built a pipeline to visualize and confirm the presence of dark matter in cosmic data based on the principle of Strong Gravitational Lensing, using PyAutoLens.</w:t>
             </w:r>
           </w:p>
           <w:p>
@@ -1498,6 +1921,7 @@
                 <w:tab w:val="clear" w:pos="916"/>
               </w:tabs>
               <w:ind w:left="252" w:hanging="180"/>
+              <w:jc w:val="both"/>
               <w:rPr>
                 <w:rFonts w:ascii="Calibri" w:hAnsi="Calibri" w:cs="Calibri"/>
                 <w:sz w:val="20"/>
@@ -1511,90 +1935,24 @@
                 <w:sz w:val="20"/>
                 <w:szCs w:val="20"/>
               </w:rPr>
-              <w:t>[C</w:t>
+              <w:t xml:space="preserve">Live </w:t>
             </w:r>
             <w:r>
               <w:rPr>
                 <w:rFonts w:ascii="Calibri" w:hAnsi="Calibri" w:cs="Calibri"/>
                 <w:b/>
-                <w:bCs/>
-                <w:sz w:val="20"/>
-                <w:szCs w:val="20"/>
-              </w:rPr>
-              <w:t>ompute</w:t>
-            </w:r>
-            <w:r>
-              <w:rPr>
-                <w:rFonts w:ascii="Calibri" w:hAnsi="Calibri" w:cs="Calibri"/>
-                <w:b/>
-                <w:sz w:val="20"/>
-                <w:szCs w:val="20"/>
-              </w:rPr>
-              <w:t>r Vision] Accident Detection:</w:t>
-            </w:r>
-            <w:r>
-              <w:rPr>
-                <w:rFonts w:ascii="Calibri" w:hAnsi="Calibri" w:cs="Calibri"/>
-                <w:sz w:val="20"/>
-                <w:szCs w:val="20"/>
-              </w:rPr>
-              <w:t xml:space="preserve"> </w:t>
-            </w:r>
-            <w:r>
-              <w:rPr>
-                <w:rFonts w:ascii="Calibri" w:hAnsi="Calibri" w:cs="Calibri"/>
-                <w:sz w:val="20"/>
-                <w:szCs w:val="20"/>
-              </w:rPr>
-              <w:t xml:space="preserve">Used transfer learning to train a model capable </w:t>
-            </w:r>
-            <w:r>
-              <w:rPr>
-                <w:rFonts w:ascii="Calibri" w:hAnsi="Calibri" w:cs="Calibri"/>
-                <w:sz w:val="20"/>
-                <w:szCs w:val="20"/>
-              </w:rPr>
-              <w:t>of</w:t>
-            </w:r>
-            <w:r>
-              <w:rPr>
-                <w:rFonts w:ascii="Calibri" w:hAnsi="Calibri" w:cs="Calibri"/>
-                <w:sz w:val="20"/>
-                <w:szCs w:val="20"/>
-              </w:rPr>
-              <w:t xml:space="preserve"> processing live</w:t>
-            </w:r>
-            <w:r>
-              <w:rPr>
-                <w:rFonts w:ascii="Calibri" w:hAnsi="Calibri" w:cs="Calibri"/>
-                <w:sz w:val="20"/>
-                <w:szCs w:val="20"/>
-              </w:rPr>
-              <w:t xml:space="preserve"> </w:t>
-            </w:r>
-            <w:r>
-              <w:rPr>
-                <w:rFonts w:ascii="Calibri" w:hAnsi="Calibri" w:cs="Calibri"/>
-                <w:sz w:val="20"/>
-                <w:szCs w:val="20"/>
-              </w:rPr>
-              <w:t>video</w:t>
-            </w:r>
-            <w:r>
-              <w:rPr>
-                <w:rFonts w:ascii="Calibri" w:hAnsi="Calibri" w:cs="Calibri"/>
-                <w:sz w:val="20"/>
-                <w:szCs w:val="20"/>
-              </w:rPr>
-              <w:t xml:space="preserve"> camera</w:t>
-            </w:r>
-            <w:r>
-              <w:rPr>
-                <w:rFonts w:ascii="Calibri" w:hAnsi="Calibri" w:cs="Calibri"/>
-                <w:sz w:val="20"/>
-                <w:szCs w:val="20"/>
-              </w:rPr>
-              <w:t xml:space="preserve"> feed at traffic intersections to spot road accidents. Secured 3</w:t>
+                <w:sz w:val="20"/>
+                <w:szCs w:val="20"/>
+              </w:rPr>
+              <w:t>Accident Detection:</w:t>
+            </w:r>
+            <w:r>
+              <w:rPr>
+                <w:rFonts w:ascii="Calibri" w:hAnsi="Calibri" w:cs="Calibri"/>
+                <w:sz w:val="20"/>
+                <w:szCs w:val="20"/>
+              </w:rPr>
+              <w:t xml:space="preserve"> Used transfer learning to train a model capable of processing live video camera feed at traffic intersections to spot road accidents. Secured 3</w:t>
             </w:r>
             <w:r>
               <w:rPr>
@@ -1624,6 +1982,7 @@
                 <w:tab w:val="clear" w:pos="916"/>
               </w:tabs>
               <w:ind w:left="252" w:hanging="180"/>
+              <w:jc w:val="both"/>
               <w:rPr>
                 <w:rFonts w:ascii="Calibri" w:hAnsi="Calibri" w:cs="Calibri"/>
                 <w:sz w:val="20"/>
@@ -1646,47 +2005,7 @@
                 <w:sz w:val="20"/>
                 <w:szCs w:val="20"/>
               </w:rPr>
-              <w:t xml:space="preserve"> Wrote software to detect muscle artifacts in</w:t>
-            </w:r>
-            <w:r>
-              <w:rPr>
-                <w:rFonts w:ascii="Calibri" w:hAnsi="Calibri" w:cs="Calibri"/>
-                <w:sz w:val="20"/>
-                <w:szCs w:val="20"/>
-              </w:rPr>
-              <w:t xml:space="preserve"> real-time</w:t>
-            </w:r>
-            <w:r>
-              <w:rPr>
-                <w:rFonts w:ascii="Calibri" w:hAnsi="Calibri" w:cs="Calibri"/>
-                <w:sz w:val="20"/>
-                <w:szCs w:val="20"/>
-              </w:rPr>
-              <w:t xml:space="preserve"> </w:t>
-            </w:r>
-            <w:r>
-              <w:rPr>
-                <w:rFonts w:ascii="Calibri" w:hAnsi="Calibri" w:cs="Calibri"/>
-                <w:sz w:val="20"/>
-                <w:szCs w:val="20"/>
-              </w:rPr>
-              <w:t xml:space="preserve">EEG data </w:t>
-            </w:r>
-            <w:r>
-              <w:rPr>
-                <w:rFonts w:ascii="Calibri" w:hAnsi="Calibri" w:cs="Calibri"/>
-                <w:sz w:val="20"/>
-                <w:szCs w:val="20"/>
-              </w:rPr>
-              <w:t>from</w:t>
-            </w:r>
-            <w:r>
-              <w:rPr>
-                <w:rFonts w:ascii="Calibri" w:hAnsi="Calibri" w:cs="Calibri"/>
-                <w:sz w:val="20"/>
-                <w:szCs w:val="20"/>
-              </w:rPr>
-              <w:t xml:space="preserve"> the NeuroSky MindWave headset, with the potential for upgraded brain mapping by attenuation of the recognized artifacts. It was tested on the Left Frontal Lobe with &gt;95% accuracy.</w:t>
+              <w:t xml:space="preserve"> Wrote software to detect muscle artifacts in real-time EEG data from the NeuroSky MindWave headset, with the potential for upgraded brain mapping by attenuation of the recognized artifacts. It was tested on the Left Frontal Lobe with &gt;95% accuracy.</w:t>
             </w:r>
           </w:p>
           <w:p>
@@ -1699,6 +2018,7 @@
                 <w:tab w:val="clear" w:pos="916"/>
               </w:tabs>
               <w:ind w:left="252" w:hanging="180"/>
+              <w:jc w:val="both"/>
               <w:rPr>
                 <w:rFonts w:ascii="Calibri" w:hAnsi="Calibri" w:cs="Calibri"/>
                 <w:sz w:val="20"/>
@@ -1713,141 +2033,40 @@
                 <w:sz w:val="20"/>
                 <w:szCs w:val="20"/>
               </w:rPr>
-              <w:t>[</w:t>
+              <w:t>[iOS Software</w:t>
             </w:r>
             <w:r>
               <w:rPr>
                 <w:rFonts w:ascii="Calibri" w:hAnsi="Calibri" w:cs="Calibri"/>
                 <w:b/>
-                <w:bCs/>
-                <w:sz w:val="20"/>
-                <w:szCs w:val="20"/>
-              </w:rPr>
-              <w:t>iOS Software</w:t>
-            </w:r>
-            <w:r>
-              <w:rPr>
-                <w:rFonts w:ascii="Calibri" w:hAnsi="Calibri" w:cs="Calibri"/>
-                <w:b/>
-                <w:sz w:val="20"/>
-                <w:szCs w:val="20"/>
-              </w:rPr>
-              <w:t xml:space="preserve"> Development]</w:t>
-            </w:r>
-            <w:r>
-              <w:rPr>
-                <w:rFonts w:ascii="Calibri" w:hAnsi="Calibri" w:cs="Calibri"/>
-                <w:b/>
-                <w:sz w:val="20"/>
-                <w:szCs w:val="20"/>
-              </w:rPr>
-              <w:t xml:space="preserve"> </w:t>
-            </w:r>
-            <w:r>
-              <w:rPr>
-                <w:rFonts w:ascii="Calibri" w:hAnsi="Calibri" w:cs="Calibri"/>
-                <w:b/>
-                <w:sz w:val="20"/>
-                <w:szCs w:val="20"/>
-              </w:rPr>
-              <w:t>Price Aggregator</w:t>
-            </w:r>
-            <w:r>
-              <w:rPr>
-                <w:rFonts w:ascii="Calibri" w:hAnsi="Calibri" w:cs="Calibri"/>
-                <w:b/>
-                <w:sz w:val="20"/>
-                <w:szCs w:val="20"/>
-              </w:rPr>
-              <w:t xml:space="preserve"> for Resellers:</w:t>
-            </w:r>
-            <w:r>
-              <w:rPr>
-                <w:rFonts w:ascii="Calibri" w:hAnsi="Calibri" w:cs="Calibri"/>
-                <w:sz w:val="20"/>
-                <w:szCs w:val="20"/>
-              </w:rPr>
-              <w:t xml:space="preserve"> </w:t>
-            </w:r>
-            <w:r>
-              <w:rPr>
-                <w:rFonts w:ascii="Calibri" w:hAnsi="Calibri" w:cs="Calibri"/>
-                <w:sz w:val="20"/>
-                <w:szCs w:val="20"/>
-              </w:rPr>
-              <w:t>Developed</w:t>
-            </w:r>
-            <w:r>
-              <w:rPr>
-                <w:rFonts w:ascii="Calibri" w:hAnsi="Calibri" w:cs="Calibri"/>
-                <w:sz w:val="20"/>
-                <w:szCs w:val="20"/>
-              </w:rPr>
-              <w:t xml:space="preserve"> a</w:t>
-            </w:r>
-            <w:r>
-              <w:rPr>
-                <w:rFonts w:ascii="Calibri" w:hAnsi="Calibri" w:cs="Calibri"/>
-                <w:sz w:val="20"/>
-                <w:szCs w:val="20"/>
-              </w:rPr>
-              <w:t xml:space="preserve">n app </w:t>
-            </w:r>
-            <w:r>
-              <w:rPr>
-                <w:rFonts w:ascii="Calibri" w:hAnsi="Calibri" w:cs="Calibri"/>
-                <w:sz w:val="20"/>
-                <w:szCs w:val="20"/>
-              </w:rPr>
-              <w:t xml:space="preserve">for a client </w:t>
-            </w:r>
-            <w:r>
-              <w:rPr>
-                <w:rFonts w:ascii="Calibri" w:hAnsi="Calibri" w:cs="Calibri"/>
-                <w:sz w:val="20"/>
-                <w:szCs w:val="20"/>
-              </w:rPr>
-              <w:t>in Bristol, United States</w:t>
-            </w:r>
-            <w:r>
-              <w:rPr>
-                <w:rFonts w:ascii="Calibri" w:hAnsi="Calibri" w:cs="Calibri"/>
-                <w:sz w:val="20"/>
-                <w:szCs w:val="20"/>
-              </w:rPr>
-              <w:t>,</w:t>
-            </w:r>
-            <w:r>
-              <w:rPr>
-                <w:rFonts w:ascii="Calibri" w:hAnsi="Calibri" w:cs="Calibri"/>
-                <w:sz w:val="20"/>
-                <w:szCs w:val="20"/>
-              </w:rPr>
-              <w:t xml:space="preserve"> </w:t>
-            </w:r>
-            <w:r>
-              <w:rPr>
-                <w:rFonts w:ascii="Calibri" w:hAnsi="Calibri" w:cs="Calibri"/>
-                <w:sz w:val="20"/>
-                <w:szCs w:val="20"/>
-              </w:rPr>
-              <w:t xml:space="preserve">that uses the </w:t>
-            </w:r>
-            <w:r>
-              <w:rPr>
-                <w:rFonts w:ascii="Calibri" w:hAnsi="Calibri" w:cs="Calibri"/>
-                <w:sz w:val="20"/>
-                <w:szCs w:val="20"/>
-              </w:rPr>
-              <w:t xml:space="preserve">iPhone </w:t>
-            </w:r>
-            <w:r>
-              <w:rPr>
-                <w:rFonts w:ascii="Calibri" w:hAnsi="Calibri" w:cs="Calibri"/>
-                <w:sz w:val="20"/>
-                <w:szCs w:val="20"/>
-              </w:rPr>
-              <w:t>camera to scan product barcodes using AVFoundation and aggregate the price history from different sources using API calls, enabling the reseller</w:t>
+                <w:sz w:val="20"/>
+                <w:szCs w:val="20"/>
+              </w:rPr>
+              <w:t xml:space="preserve"> Development] Price Aggregator for Resellers:</w:t>
+            </w:r>
+            <w:r>
+              <w:rPr>
+                <w:rFonts w:ascii="Calibri" w:hAnsi="Calibri" w:cs="Calibri"/>
+                <w:sz w:val="20"/>
+                <w:szCs w:val="20"/>
+              </w:rPr>
+              <w:t xml:space="preserve"> Developed an</w:t>
+            </w:r>
+            <w:r>
+              <w:rPr>
+                <w:rFonts w:ascii="Calibri" w:hAnsi="Calibri" w:cs="Calibri"/>
+                <w:sz w:val="20"/>
+                <w:szCs w:val="20"/>
+              </w:rPr>
+              <w:t xml:space="preserve"> iOS</w:t>
+            </w:r>
+            <w:r>
+              <w:rPr>
+                <w:rFonts w:ascii="Calibri" w:hAnsi="Calibri" w:cs="Calibri"/>
+                <w:sz w:val="20"/>
+                <w:szCs w:val="20"/>
+              </w:rPr>
+              <w:t xml:space="preserve"> app for a client in Bristol, United States, that scan</w:t>
             </w:r>
             <w:r>
               <w:rPr>
@@ -1863,29 +2082,43 @@
                 <w:sz w:val="20"/>
                 <w:szCs w:val="20"/>
               </w:rPr>
-              <w:t xml:space="preserve"> to make an informed decision.</w:t>
-            </w:r>
-          </w:p>
-          <w:p>
-            <w:pPr>
-              <w:ind w:left="252"/>
-              <w:rPr>
-                <w:rFonts w:ascii="Calibri" w:hAnsi="Calibri" w:cs="Calibri"/>
-                <w:sz w:val="20"/>
-                <w:szCs w:val="20"/>
-              </w:rPr>
-            </w:pPr>
+              <w:t xml:space="preserve"> product barcodes using AVFoundation and aggregate</w:t>
+            </w:r>
+            <w:r>
+              <w:rPr>
+                <w:rFonts w:ascii="Calibri" w:hAnsi="Calibri" w:cs="Calibri"/>
+                <w:sz w:val="20"/>
+                <w:szCs w:val="20"/>
+              </w:rPr>
+              <w:t>s</w:t>
+            </w:r>
+            <w:r>
+              <w:rPr>
+                <w:rFonts w:ascii="Calibri" w:hAnsi="Calibri" w:cs="Calibri"/>
+                <w:sz w:val="20"/>
+                <w:szCs w:val="20"/>
+              </w:rPr>
+              <w:t xml:space="preserve"> the price history from different sources</w:t>
+            </w:r>
+            <w:r>
+              <w:rPr>
+                <w:rFonts w:ascii="Calibri" w:hAnsi="Calibri" w:cs="Calibri"/>
+                <w:sz w:val="20"/>
+                <w:szCs w:val="20"/>
+              </w:rPr>
+              <w:t>.</w:t>
+            </w:r>
           </w:p>
         </w:tc>
       </w:tr>
       <w:tr>
         <w:trPr>
-          <w:trHeight w:val="266"/>
+          <w:trHeight w:val="264"/>
         </w:trPr>
         <w:tc>
           <w:tcPr>
             <w:tcW w:w="5000" w:type="pct"/>
-            <w:gridSpan w:val="7"/>
+            <w:gridSpan w:val="9"/>
             <w:tcBorders>
               <w:bottom w:val="single" w:sz="4" w:space="0" w:color="auto"/>
             </w:tcBorders>
@@ -1895,484 +2128,34 @@
             <w:pPr>
               <w:rPr>
                 <w:rFonts w:ascii="Calibri" w:hAnsi="Calibri" w:cs="Calibri"/>
-                <w:smallCaps/>
-                <w:sz w:val="20"/>
-                <w:szCs w:val="20"/>
-              </w:rPr>
-            </w:pPr>
-            <w:r>
-              <w:rPr>
-                <w:rFonts w:ascii="Calibri" w:hAnsi="Calibri" w:cs="Calibri"/>
                 <w:b/>
                 <w:smallCaps/>
-                <w:sz w:val="20"/>
-                <w:szCs w:val="20"/>
-              </w:rPr>
-              <w:t>Education</w:t>
+                <w:spacing w:val="86"/>
+                <w:sz w:val="20"/>
+                <w:szCs w:val="20"/>
+              </w:rPr>
+            </w:pPr>
+            <w:r>
+              <w:rPr>
+                <w:rFonts w:ascii="Calibri" w:hAnsi="Calibri" w:cs="Calibri"/>
+                <w:b/>
+                <w:smallCaps/>
+                <w:sz w:val="20"/>
+                <w:szCs w:val="20"/>
+              </w:rPr>
+              <w:t>Volunteer &amp; Additional Experience</w:t>
             </w:r>
           </w:p>
         </w:tc>
       </w:tr>
       <w:tr>
         <w:trPr>
-          <w:trHeight w:val="259"/>
-        </w:trPr>
-        <w:tc>
-          <w:tcPr>
-            <w:tcW w:w="998" w:type="pct"/>
-            <w:tcBorders>
-              <w:top w:val="single" w:sz="4" w:space="0" w:color="auto"/>
-            </w:tcBorders>
-            <w:shd w:val="clear" w:color="auto" w:fill="auto"/>
-          </w:tcPr>
-          <w:p>
-            <w:pPr>
-              <w:rPr>
-                <w:rFonts w:ascii="Calibri" w:hAnsi="Calibri" w:cs="Calibri"/>
-                <w:b/>
-                <w:i/>
-                <w:iCs/>
-                <w:sz w:val="20"/>
-                <w:szCs w:val="20"/>
-              </w:rPr>
-            </w:pPr>
-          </w:p>
-        </w:tc>
-        <w:tc>
-          <w:tcPr>
-            <w:tcW w:w="2973" w:type="pct"/>
-            <w:gridSpan w:val="5"/>
-            <w:tcBorders>
-              <w:top w:val="single" w:sz="4" w:space="0" w:color="auto"/>
-            </w:tcBorders>
-            <w:shd w:val="clear" w:color="auto" w:fill="auto"/>
-          </w:tcPr>
-          <w:p>
-            <w:pPr>
-              <w:ind w:left="72"/>
-              <w:jc w:val="center"/>
-              <w:rPr>
-                <w:rFonts w:ascii="Calibri" w:hAnsi="Calibri" w:cs="Calibri"/>
-                <w:b/>
-                <w:i/>
-                <w:iCs/>
-                <w:sz w:val="20"/>
-                <w:szCs w:val="20"/>
-              </w:rPr>
-            </w:pPr>
-            <w:r>
-              <w:rPr>
-                <w:rFonts w:ascii="Calibri" w:hAnsi="Calibri" w:cs="Calibri"/>
-                <w:b/>
-                <w:i/>
-                <w:iCs/>
-                <w:sz w:val="20"/>
-                <w:szCs w:val="20"/>
-              </w:rPr>
-              <w:t>Panjab University</w:t>
-            </w:r>
-            <w:r>
-              <w:rPr>
-                <w:rFonts w:ascii="Calibri" w:hAnsi="Calibri" w:cs="Calibri"/>
-                <w:b/>
-                <w:i/>
-                <w:iCs/>
-                <w:sz w:val="20"/>
-                <w:szCs w:val="20"/>
-              </w:rPr>
-              <w:t>, India</w:t>
-            </w:r>
-          </w:p>
-        </w:tc>
-        <w:tc>
-          <w:tcPr>
-            <w:tcW w:w="1030" w:type="pct"/>
-            <w:tcBorders>
-              <w:top w:val="single" w:sz="4" w:space="0" w:color="auto"/>
-            </w:tcBorders>
-            <w:shd w:val="clear" w:color="auto" w:fill="auto"/>
-          </w:tcPr>
-          <w:p>
-            <w:pPr>
-              <w:jc w:val="right"/>
-              <w:rPr>
-                <w:rFonts w:ascii="Calibri" w:hAnsi="Calibri" w:cs="Calibri"/>
-                <w:b/>
-                <w:i/>
-                <w:iCs/>
-                <w:sz w:val="20"/>
-                <w:szCs w:val="20"/>
-              </w:rPr>
-            </w:pPr>
-            <w:r>
-              <w:rPr>
-                <w:rFonts w:ascii="Calibri" w:hAnsi="Calibri" w:cs="Calibri"/>
-                <w:b/>
-                <w:i/>
-                <w:iCs/>
-                <w:sz w:val="20"/>
-                <w:szCs w:val="20"/>
-              </w:rPr>
-              <w:t>Jul 2017 – Jun 2021</w:t>
-            </w:r>
-          </w:p>
-        </w:tc>
-      </w:tr>
-      <w:tr>
-        <w:trPr>
-          <w:trHeight w:val="59"/>
+          <w:trHeight w:val="619"/>
         </w:trPr>
         <w:tc>
           <w:tcPr>
             <w:tcW w:w="5000" w:type="pct"/>
-            <w:gridSpan w:val="7"/>
-            <w:shd w:val="clear" w:color="auto" w:fill="auto"/>
-          </w:tcPr>
-          <w:p>
-            <w:pPr>
-              <w:numPr>
-                <w:ilvl w:val="0"/>
-                <w:numId w:val="5"/>
-              </w:numPr>
-              <w:tabs>
-                <w:tab w:val="clear" w:pos="720"/>
-              </w:tabs>
-              <w:ind w:left="252" w:hanging="180"/>
-              <w:rPr>
-                <w:rFonts w:ascii="Calibri" w:hAnsi="Calibri" w:cs="Calibri"/>
-                <w:sz w:val="20"/>
-                <w:szCs w:val="20"/>
-              </w:rPr>
-            </w:pPr>
-            <w:r>
-              <w:rPr>
-                <w:rFonts w:ascii="Calibri" w:hAnsi="Calibri" w:cs="Calibri"/>
-                <w:sz w:val="20"/>
-                <w:szCs w:val="20"/>
-              </w:rPr>
-              <w:t>Bachelor of Engineering (B.E.) in Information Technology</w:t>
-            </w:r>
-            <w:r>
-              <w:rPr>
-                <w:rFonts w:ascii="Calibri" w:hAnsi="Calibri" w:cs="Calibri"/>
-                <w:sz w:val="20"/>
-                <w:szCs w:val="20"/>
-              </w:rPr>
-              <w:t xml:space="preserve"> (with Honors).</w:t>
-            </w:r>
-          </w:p>
-          <w:p>
-            <w:pPr>
-              <w:ind w:left="252"/>
-              <w:rPr>
-                <w:rFonts w:ascii="Calibri" w:hAnsi="Calibri" w:cs="Calibri"/>
-                <w:sz w:val="20"/>
-                <w:szCs w:val="20"/>
-              </w:rPr>
-            </w:pPr>
-          </w:p>
-        </w:tc>
-      </w:tr>
-      <w:tr>
-        <w:trPr>
-          <w:trHeight w:val="73"/>
-        </w:trPr>
-        <w:tc>
-          <w:tcPr>
-            <w:tcW w:w="5000" w:type="pct"/>
-            <w:gridSpan w:val="7"/>
-            <w:tcBorders>
-              <w:bottom w:val="single" w:sz="4" w:space="0" w:color="auto"/>
-            </w:tcBorders>
-            <w:shd w:val="clear" w:color="auto" w:fill="auto"/>
-          </w:tcPr>
-          <w:p>
-            <w:pPr>
-              <w:rPr>
-                <w:rFonts w:ascii="Calibri" w:hAnsi="Calibri" w:cs="Calibri"/>
-                <w:b/>
-                <w:bCs/>
-                <w:sz w:val="20"/>
-                <w:szCs w:val="20"/>
-              </w:rPr>
-            </w:pPr>
-            <w:r>
-              <w:rPr>
-                <w:rFonts w:ascii="Calibri" w:hAnsi="Calibri" w:cs="Calibri"/>
-                <w:b/>
-                <w:smallCaps/>
-                <w:sz w:val="20"/>
-                <w:szCs w:val="20"/>
-              </w:rPr>
-              <w:t>Achievements</w:t>
-            </w:r>
-          </w:p>
-        </w:tc>
-      </w:tr>
-      <w:tr>
-        <w:trPr>
-          <w:trHeight w:val="73"/>
-        </w:trPr>
-        <w:tc>
-          <w:tcPr>
-            <w:tcW w:w="1673" w:type="pct"/>
-            <w:gridSpan w:val="3"/>
-            <w:shd w:val="clear" w:color="auto" w:fill="auto"/>
-          </w:tcPr>
-          <w:p>
-            <w:pPr>
-              <w:ind w:left="72"/>
-              <w:rPr>
-                <w:rFonts w:ascii="Calibri" w:hAnsi="Calibri" w:cs="Calibri"/>
-                <w:b/>
-                <w:bCs/>
-                <w:i/>
-                <w:iCs/>
-                <w:sz w:val="20"/>
-                <w:szCs w:val="20"/>
-              </w:rPr>
-            </w:pPr>
-            <w:r>
-              <w:rPr>
-                <w:rFonts w:ascii="Calibri" w:hAnsi="Calibri" w:cs="Calibri"/>
-                <w:b/>
-                <w:bCs/>
-                <w:i/>
-                <w:iCs/>
-                <w:sz w:val="20"/>
-                <w:szCs w:val="20"/>
-              </w:rPr>
-              <w:t>6-month Deep Learning Nanodegree</w:t>
-            </w:r>
-          </w:p>
-        </w:tc>
-        <w:tc>
-          <w:tcPr>
-            <w:tcW w:w="1621" w:type="pct"/>
-            <w:shd w:val="clear" w:color="auto" w:fill="auto"/>
-          </w:tcPr>
-          <w:p>
-            <w:pPr>
-              <w:ind w:left="72"/>
-              <w:jc w:val="center"/>
-              <w:rPr>
-                <w:rFonts w:ascii="Calibri" w:hAnsi="Calibri" w:cs="Calibri"/>
-                <w:b/>
-                <w:bCs/>
-                <w:i/>
-                <w:iCs/>
-                <w:sz w:val="20"/>
-                <w:szCs w:val="20"/>
-              </w:rPr>
-            </w:pPr>
-            <w:r>
-              <w:rPr>
-                <w:rFonts w:ascii="Calibri" w:hAnsi="Calibri" w:cs="Calibri"/>
-                <w:b/>
-                <w:bCs/>
-                <w:i/>
-                <w:iCs/>
-                <w:sz w:val="20"/>
-                <w:szCs w:val="20"/>
-              </w:rPr>
-              <w:t>Udacity / Facebook AI</w:t>
-            </w:r>
-          </w:p>
-        </w:tc>
-        <w:tc>
-          <w:tcPr>
-            <w:tcW w:w="1706" w:type="pct"/>
-            <w:gridSpan w:val="3"/>
-            <w:shd w:val="clear" w:color="auto" w:fill="auto"/>
-          </w:tcPr>
-          <w:p>
-            <w:pPr>
-              <w:ind w:left="72"/>
-              <w:jc w:val="right"/>
-              <w:rPr>
-                <w:rFonts w:ascii="Calibri" w:hAnsi="Calibri" w:cs="Calibri"/>
-                <w:b/>
-                <w:bCs/>
-                <w:i/>
-                <w:iCs/>
-                <w:sz w:val="20"/>
-                <w:szCs w:val="20"/>
-              </w:rPr>
-            </w:pPr>
-            <w:r>
-              <w:rPr>
-                <w:rFonts w:ascii="Calibri" w:hAnsi="Calibri" w:cs="Calibri"/>
-                <w:b/>
-                <w:bCs/>
-                <w:i/>
-                <w:iCs/>
-                <w:sz w:val="20"/>
-                <w:szCs w:val="20"/>
-              </w:rPr>
-              <w:t>Nov 2018 – May 2019</w:t>
-            </w:r>
-          </w:p>
-        </w:tc>
-      </w:tr>
-      <w:tr>
-        <w:trPr>
-          <w:trHeight w:val="315"/>
-        </w:trPr>
-        <w:tc>
-          <w:tcPr>
-            <w:tcW w:w="5000" w:type="pct"/>
-            <w:gridSpan w:val="7"/>
-            <w:shd w:val="clear" w:color="auto" w:fill="auto"/>
-          </w:tcPr>
-          <w:p>
-            <w:pPr>
-              <w:numPr>
-                <w:ilvl w:val="0"/>
-                <w:numId w:val="5"/>
-              </w:numPr>
-              <w:tabs>
-                <w:tab w:val="clear" w:pos="720"/>
-              </w:tabs>
-              <w:ind w:left="252" w:hanging="180"/>
-              <w:rPr>
-                <w:rFonts w:ascii="Calibri" w:hAnsi="Calibri" w:cs="Calibri"/>
-                <w:sz w:val="20"/>
-                <w:szCs w:val="20"/>
-              </w:rPr>
-            </w:pPr>
-            <w:r>
-              <w:rPr>
-                <w:rFonts w:ascii="Calibri" w:hAnsi="Calibri" w:cs="Calibri"/>
-                <w:sz w:val="20"/>
-                <w:szCs w:val="20"/>
-              </w:rPr>
-              <w:t xml:space="preserve">Credential ID: </w:t>
-            </w:r>
-            <w:hyperlink r:id="rId9" w:tooltip="https://graduation.udacity.com/confirm/C9HLTFDN" w:history="1">
-              <w:r>
-                <w:rPr>
-                  <w:rStyle w:val="Hyperlink"/>
-                  <w:rFonts w:ascii="Calibri" w:hAnsi="Calibri" w:cs="Calibri"/>
-                  <w:sz w:val="20"/>
-                  <w:szCs w:val="20"/>
-                </w:rPr>
-                <w:t xml:space="preserve">C9HLTFDN </w:t>
-              </w:r>
-            </w:hyperlink>
-          </w:p>
-          <w:p>
-            <w:pPr>
-              <w:numPr>
-                <w:ilvl w:val="0"/>
-                <w:numId w:val="5"/>
-              </w:numPr>
-              <w:tabs>
-                <w:tab w:val="clear" w:pos="720"/>
-              </w:tabs>
-              <w:ind w:left="252" w:hanging="180"/>
-              <w:rPr>
-                <w:rFonts w:ascii="Calibri" w:hAnsi="Calibri" w:cs="Calibri"/>
-                <w:sz w:val="20"/>
-                <w:szCs w:val="20"/>
-              </w:rPr>
-            </w:pPr>
-            <w:r>
-              <w:rPr>
-                <w:rFonts w:ascii="Calibri" w:hAnsi="Calibri" w:cs="Calibri"/>
-                <w:sz w:val="20"/>
-                <w:szCs w:val="20"/>
-              </w:rPr>
-              <w:t>Full Scholarship by Facebook (acceptance rate of 3%) - out of 10,000 global applicants of diverse qualifications.</w:t>
-            </w:r>
-          </w:p>
-          <w:p>
-            <w:pPr>
-              <w:numPr>
-                <w:ilvl w:val="0"/>
-                <w:numId w:val="5"/>
-              </w:numPr>
-              <w:tabs>
-                <w:tab w:val="clear" w:pos="720"/>
-              </w:tabs>
-              <w:ind w:left="252" w:hanging="180"/>
-              <w:rPr>
-                <w:rFonts w:ascii="Calibri" w:hAnsi="Calibri" w:cs="Calibri"/>
-                <w:sz w:val="20"/>
-                <w:szCs w:val="20"/>
-              </w:rPr>
-            </w:pPr>
-            <w:r>
-              <w:rPr>
-                <w:rFonts w:ascii="Calibri" w:hAnsi="Calibri" w:cs="Calibri"/>
-                <w:sz w:val="20"/>
-                <w:szCs w:val="20"/>
-              </w:rPr>
-              <w:t>Coursework: Computer Vision, Recurrent Neural Networks, Generative Adversarial Networks, AWS Deployment.</w:t>
-            </w:r>
-          </w:p>
-          <w:p>
-            <w:pPr>
-              <w:ind w:left="252"/>
-              <w:rPr>
-                <w:rFonts w:ascii="Calibri" w:hAnsi="Calibri" w:cs="Calibri"/>
-                <w:sz w:val="20"/>
-                <w:szCs w:val="20"/>
-              </w:rPr>
-            </w:pPr>
-          </w:p>
-        </w:tc>
-      </w:tr>
-      <w:tr>
-        <w:trPr>
-          <w:trHeight w:val="73"/>
-        </w:trPr>
-        <w:tc>
-          <w:tcPr>
-            <w:tcW w:w="5000" w:type="pct"/>
-            <w:gridSpan w:val="7"/>
-            <w:tcBorders>
-              <w:bottom w:val="single" w:sz="4" w:space="0" w:color="auto"/>
-            </w:tcBorders>
-            <w:shd w:val="clear" w:color="auto" w:fill="auto"/>
-          </w:tcPr>
-          <w:p>
-            <w:pPr>
-              <w:rPr>
-                <w:rFonts w:ascii="Calibri" w:hAnsi="Calibri" w:cs="Calibri"/>
-                <w:sz w:val="20"/>
-                <w:szCs w:val="20"/>
-              </w:rPr>
-            </w:pPr>
-            <w:r>
-              <w:rPr>
-                <w:rFonts w:ascii="Calibri" w:hAnsi="Calibri" w:cs="Calibri"/>
-                <w:b/>
-                <w:smallCaps/>
-                <w:sz w:val="20"/>
-                <w:szCs w:val="20"/>
-              </w:rPr>
-              <w:t>Skills &amp; Technologies</w:t>
-            </w:r>
-            <w:r>
-              <w:rPr>
-                <w:rFonts w:ascii="Calibri" w:hAnsi="Calibri" w:cs="Calibri"/>
-                <w:b/>
-                <w:sz w:val="20"/>
-                <w:szCs w:val="20"/>
-              </w:rPr>
-              <w:t xml:space="preserve"> </w:t>
-            </w:r>
-          </w:p>
-        </w:tc>
-      </w:tr>
-      <w:tr>
-        <w:trPr>
-          <w:trHeight w:val="73"/>
-        </w:trPr>
-        <w:tc>
-          <w:tcPr>
-            <w:tcW w:w="5000" w:type="pct"/>
-            <w:gridSpan w:val="7"/>
+            <w:gridSpan w:val="9"/>
             <w:tcBorders>
               <w:top w:val="single" w:sz="4" w:space="0" w:color="auto"/>
             </w:tcBorders>
@@ -2388,14 +2171,15 @@
             <w:r>
               <w:rPr>
                 <w:rFonts w:ascii="Calibri" w:hAnsi="Calibri" w:cs="Calibri"/>
-              </w:rPr>
-              <w:t>C++, Python, Swift, JavaScript, Bash, SQL</w:t>
-            </w:r>
-            <w:r>
-              <w:rPr>
-                <w:rFonts w:ascii="Calibri" w:hAnsi="Calibri" w:cs="Calibri"/>
-              </w:rPr>
-              <w:t>, Hive</w:t>
+                <w:b/>
+              </w:rPr>
+              <w:t>Speaker at the Programming Club, UIET:</w:t>
+            </w:r>
+            <w:r>
+              <w:rPr>
+                <w:rFonts w:ascii="Calibri" w:hAnsi="Calibri" w:cs="Calibri"/>
+              </w:rPr>
+              <w:t xml:space="preserve"> Guided freshmen CS students and taught introductory Machine Learning.</w:t>
             </w:r>
           </w:p>
           <w:p>
@@ -2408,178 +2192,7 @@
             <w:r>
               <w:rPr>
                 <w:rFonts w:ascii="Calibri" w:hAnsi="Calibri" w:cs="Calibri"/>
-              </w:rPr>
-              <w:t xml:space="preserve">Flask, TensorFlow, PyTorch, Xcode, </w:t>
-            </w:r>
-            <w:r>
-              <w:rPr>
-                <w:rFonts w:ascii="Calibri" w:hAnsi="Calibri" w:cs="Calibri"/>
-              </w:rPr>
-              <w:t xml:space="preserve">Git, </w:t>
-            </w:r>
-            <w:r>
-              <w:rPr>
-                <w:rFonts w:ascii="Calibri" w:hAnsi="Calibri" w:cs="Calibri"/>
-              </w:rPr>
-              <w:t xml:space="preserve">Jenkins CI/CD, </w:t>
-            </w:r>
-            <w:r>
-              <w:rPr>
-                <w:rFonts w:ascii="Calibri" w:hAnsi="Calibri" w:cs="Calibri"/>
-              </w:rPr>
-              <w:t>Docker with</w:t>
-            </w:r>
-            <w:r>
-              <w:rPr>
-                <w:rFonts w:ascii="Calibri" w:hAnsi="Calibri" w:cs="Calibri"/>
-              </w:rPr>
-              <w:t xml:space="preserve"> some</w:t>
-            </w:r>
-            <w:r>
-              <w:rPr>
-                <w:rFonts w:ascii="Calibri" w:hAnsi="Calibri" w:cs="Calibri"/>
-              </w:rPr>
-              <w:t xml:space="preserve"> exposure to</w:t>
-            </w:r>
-            <w:r>
-              <w:rPr>
-                <w:rFonts w:ascii="Calibri" w:hAnsi="Calibri" w:cs="Calibri"/>
-              </w:rPr>
-              <w:t xml:space="preserve"> Kubernetes</w:t>
-            </w:r>
-          </w:p>
-          <w:p>
-            <w:pPr>
-              <w:pStyle w:val="Achievement"/>
-              <w:rPr>
-                <w:rFonts w:ascii="Calibri" w:hAnsi="Calibri" w:cs="Calibri"/>
-              </w:rPr>
-            </w:pPr>
-            <w:r>
-              <w:rPr>
-                <w:rFonts w:ascii="Calibri" w:hAnsi="Calibri" w:cs="Calibri"/>
-              </w:rPr>
-              <w:t>Backend Web Development, iOS App Development, Machine Learning</w:t>
-            </w:r>
-          </w:p>
-          <w:p>
-            <w:pPr>
-              <w:ind w:left="252"/>
-              <w:rPr>
-                <w:rFonts w:ascii="Calibri" w:hAnsi="Calibri" w:cs="Calibri"/>
-                <w:sz w:val="20"/>
-                <w:szCs w:val="20"/>
-              </w:rPr>
-            </w:pPr>
-          </w:p>
-        </w:tc>
-      </w:tr>
-      <w:tr>
-        <w:trPr>
-          <w:trHeight w:val="266"/>
-        </w:trPr>
-        <w:tc>
-          <w:tcPr>
-            <w:tcW w:w="5000" w:type="pct"/>
-            <w:gridSpan w:val="7"/>
-            <w:tcBorders>
-              <w:bottom w:val="single" w:sz="4" w:space="0" w:color="auto"/>
-            </w:tcBorders>
-            <w:shd w:val="clear" w:color="auto" w:fill="auto"/>
-          </w:tcPr>
-          <w:p>
-            <w:pPr>
-              <w:rPr>
-                <w:rFonts w:ascii="Calibri" w:hAnsi="Calibri" w:cs="Calibri"/>
                 <w:b/>
-                <w:smallCaps/>
-                <w:spacing w:val="86"/>
-                <w:sz w:val="20"/>
-                <w:szCs w:val="20"/>
-              </w:rPr>
-            </w:pPr>
-            <w:r>
-              <w:rPr>
-                <w:rFonts w:ascii="Calibri" w:hAnsi="Calibri" w:cs="Calibri"/>
-                <w:b/>
-                <w:smallCaps/>
-                <w:sz w:val="20"/>
-                <w:szCs w:val="20"/>
-              </w:rPr>
-              <w:t>Volunteer &amp; Additional Experience</w:t>
-            </w:r>
-          </w:p>
-        </w:tc>
-      </w:tr>
-      <w:tr>
-        <w:trPr>
-          <w:trHeight w:val="622"/>
-        </w:trPr>
-        <w:tc>
-          <w:tcPr>
-            <w:tcW w:w="5000" w:type="pct"/>
-            <w:gridSpan w:val="7"/>
-            <w:tcBorders>
-              <w:top w:val="single" w:sz="4" w:space="0" w:color="auto"/>
-            </w:tcBorders>
-            <w:shd w:val="clear" w:color="auto" w:fill="auto"/>
-          </w:tcPr>
-          <w:p>
-            <w:pPr>
-              <w:pStyle w:val="Achievement"/>
-              <w:rPr>
-                <w:rFonts w:ascii="Calibri" w:hAnsi="Calibri" w:cs="Calibri"/>
-              </w:rPr>
-            </w:pPr>
-            <w:r>
-              <w:rPr>
-                <w:rFonts w:ascii="Calibri" w:hAnsi="Calibri" w:cs="Calibri"/>
-                <w:b/>
-              </w:rPr>
-              <w:t>Speaker at the Programming Club, UIET:</w:t>
-            </w:r>
-            <w:r>
-              <w:rPr>
-                <w:rFonts w:ascii="Calibri" w:hAnsi="Calibri" w:cs="Calibri"/>
-              </w:rPr>
-              <w:t xml:space="preserve"> </w:t>
-            </w:r>
-            <w:r>
-              <w:rPr>
-                <w:rFonts w:ascii="Calibri" w:hAnsi="Calibri" w:cs="Calibri"/>
-              </w:rPr>
-              <w:t>Guided</w:t>
-            </w:r>
-            <w:r>
-              <w:rPr>
-                <w:rFonts w:ascii="Calibri" w:hAnsi="Calibri" w:cs="Calibri"/>
-              </w:rPr>
-              <w:t xml:space="preserve"> freshmen CS students</w:t>
-            </w:r>
-            <w:r>
-              <w:rPr>
-                <w:rFonts w:ascii="Calibri" w:hAnsi="Calibri" w:cs="Calibri"/>
-              </w:rPr>
-              <w:t xml:space="preserve"> and taught introductory Machine Learning</w:t>
-            </w:r>
-            <w:r>
-              <w:rPr>
-                <w:rFonts w:ascii="Calibri" w:hAnsi="Calibri" w:cs="Calibri"/>
-              </w:rPr>
-              <w:t>.</w:t>
-            </w:r>
-          </w:p>
-          <w:p>
-            <w:pPr>
-              <w:pStyle w:val="Achievement"/>
-              <w:rPr>
-                <w:rFonts w:ascii="Calibri" w:hAnsi="Calibri" w:cs="Calibri"/>
-              </w:rPr>
-            </w:pPr>
-            <w:r>
-              <w:rPr>
-                <w:rFonts w:ascii="Calibri" w:hAnsi="Calibri" w:cs="Calibri"/>
-                <w:b/>
               </w:rPr>
               <w:t>Mowgli Aid:</w:t>
             </w:r>
@@ -2587,35 +2200,7 @@
               <w:rPr>
                 <w:rFonts w:ascii="Calibri" w:hAnsi="Calibri" w:cs="Calibri"/>
               </w:rPr>
-              <w:t xml:space="preserve"> </w:t>
-            </w:r>
-            <w:r>
-              <w:rPr>
-                <w:rFonts w:ascii="Calibri" w:hAnsi="Calibri" w:cs="Calibri"/>
-              </w:rPr>
-              <w:t>Volunteering to rescue and rehabilitate stray and injured animals in the Chandigarh Tricity Area.</w:t>
-            </w:r>
-          </w:p>
-          <w:p>
-            <w:pPr>
-              <w:pStyle w:val="Achievement"/>
-              <w:rPr>
-                <w:rFonts w:ascii="Calibri" w:hAnsi="Calibri" w:cs="Calibri"/>
-              </w:rPr>
-            </w:pPr>
-            <w:r>
-              <w:rPr>
-                <w:rFonts w:ascii="Calibri" w:hAnsi="Calibri" w:cs="Calibri"/>
-                <w:b/>
-              </w:rPr>
-              <w:t xml:space="preserve">Udacity Mentor: </w:t>
-            </w:r>
-            <w:r>
-              <w:rPr>
-                <w:rFonts w:ascii="Calibri" w:hAnsi="Calibri" w:cs="Calibri"/>
-                <w:bCs w:val="0"/>
-              </w:rPr>
-              <w:t>Facilitated smooth flow of Deep Learning Nanodegree program on Udacity’s behalf.</w:t>
+              <w:t xml:space="preserve"> Volunteering to rescue and rehabilitate stray and injured animals in the Chandigarh Tricity Area.</w:t>
             </w:r>
           </w:p>
         </w:tc>
@@ -2632,7 +2217,7 @@
     </w:p>
     <w:sectPr>
       <w:pgSz w:w="11900" w:h="16840"/>
-      <w:pgMar w:top="964" w:right="964" w:bottom="907" w:left="907" w:header="720" w:footer="720" w:gutter="0"/>
+      <w:pgMar w:top="816" w:right="964" w:bottom="816" w:left="964" w:header="720" w:footer="720" w:gutter="0"/>
       <w:cols w:space="720"/>
       <w:docGrid w:linePitch="360"/>
     </w:sectPr>
@@ -2641,7 +2226,7 @@
 </file>
 
 <file path=word/endnotes.xml><?xml version="1.0" encoding="utf-8"?>
-<w:endnotes xmlns:wpc="http://schemas.microsoft.com/office/word/2010/wordprocessingCanvas" xmlns:cx="http://schemas.microsoft.com/office/drawing/2014/chartex" xmlns:cx1="http://schemas.microsoft.com/office/drawing/2015/9/8/chartex" xmlns:cx2="http://schemas.microsoft.com/office/drawing/2015/10/21/chartex" xmlns:cx3="http://schemas.microsoft.com/office/drawing/2016/5/9/chartex" xmlns:cx4="http://schemas.microsoft.com/office/drawing/2016/5/10/chartex" xmlns:cx5="http://schemas.microsoft.com/office/drawing/2016/5/11/chartex" xmlns:cx6="http://schemas.microsoft.com/office/drawing/2016/5/12/chartex" xmlns:cx7="http://schemas.microsoft.com/office/drawing/2016/5/13/chartex" xmlns:cx8="http://schemas.microsoft.com/office/drawing/2016/5/14/chartex" xmlns:mc="http://schemas.openxmlformats.org/markup-compatibility/2006" xmlns:aink="http://schemas.microsoft.com/office/drawing/2016/ink" xmlns:am3d="http://schemas.microsoft.com/office/drawing/2017/model3d" xmlns:o="urn:schemas-microsoft-com:office:office" xmlns:r="http://schemas.openxmlformats.org/officeDocument/2006/relationships" xmlns:m="http://schemas.openxmlformats.org/officeDocument/2006/math" xmlns:v="urn:schemas-microsoft-com:vml" xmlns:wp14="http://schemas.microsoft.com/office/word/2010/wordprocessingDrawing" xmlns:wp="http://schemas.openxmlformats.org/drawingml/2006/wordprocessingDrawing" xmlns:w10="urn:schemas-microsoft-com:office:word" xmlns:w="http://schemas.openxmlformats.org/wordprocessingml/2006/main" xmlns:w14="http://schemas.microsoft.com/office/word/2010/wordml" xmlns:w15="http://schemas.microsoft.com/office/word/2012/wordml" xmlns:w16cex="http://schemas.microsoft.com/office/word/2018/wordml/cex" xmlns:w16cid="http://schemas.microsoft.com/office/word/2016/wordml/cid" xmlns:w16="http://schemas.microsoft.com/office/word/2018/wordml" xmlns:w16se="http://schemas.microsoft.com/office/word/2015/wordml/symex" xmlns:wpg="http://schemas.microsoft.com/office/word/2010/wordprocessingGroup" xmlns:wpi="http://schemas.microsoft.com/office/word/2010/wordprocessingInk" xmlns:wne="http://schemas.microsoft.com/office/word/2006/wordml" xmlns:wps="http://schemas.microsoft.com/office/word/2010/wordprocessingShape" mc:Ignorable="w14 w15 w16se w16cid w16 w16cex wp14">
+<w:endnotes xmlns:wpc="http://schemas.microsoft.com/office/word/2010/wordprocessingCanvas" xmlns:cx="http://schemas.microsoft.com/office/drawing/2014/chartex" xmlns:cx1="http://schemas.microsoft.com/office/drawing/2015/9/8/chartex" xmlns:cx2="http://schemas.microsoft.com/office/drawing/2015/10/21/chartex" xmlns:cx3="http://schemas.microsoft.com/office/drawing/2016/5/9/chartex" xmlns:cx4="http://schemas.microsoft.com/office/drawing/2016/5/10/chartex" xmlns:cx5="http://schemas.microsoft.com/office/drawing/2016/5/11/chartex" xmlns:cx6="http://schemas.microsoft.com/office/drawing/2016/5/12/chartex" xmlns:cx7="http://schemas.microsoft.com/office/drawing/2016/5/13/chartex" xmlns:cx8="http://schemas.microsoft.com/office/drawing/2016/5/14/chartex" xmlns:mc="http://schemas.openxmlformats.org/markup-compatibility/2006" xmlns:aink="http://schemas.microsoft.com/office/drawing/2016/ink" xmlns:am3d="http://schemas.microsoft.com/office/drawing/2017/model3d" xmlns:o="urn:schemas-microsoft-com:office:office" xmlns:oel="http://schemas.microsoft.com/office/2019/extlst" xmlns:r="http://schemas.openxmlformats.org/officeDocument/2006/relationships" xmlns:m="http://schemas.openxmlformats.org/officeDocument/2006/math" xmlns:v="urn:schemas-microsoft-com:vml" xmlns:wp14="http://schemas.microsoft.com/office/word/2010/wordprocessingDrawing" xmlns:wp="http://schemas.openxmlformats.org/drawingml/2006/wordprocessingDrawing" xmlns:w10="urn:schemas-microsoft-com:office:word" xmlns:w="http://schemas.openxmlformats.org/wordprocessingml/2006/main" xmlns:w14="http://schemas.microsoft.com/office/word/2010/wordml" xmlns:w15="http://schemas.microsoft.com/office/word/2012/wordml" xmlns:w16cex="http://schemas.microsoft.com/office/word/2018/wordml/cex" xmlns:w16cid="http://schemas.microsoft.com/office/word/2016/wordml/cid" xmlns:w16="http://schemas.microsoft.com/office/word/2018/wordml" xmlns:w16sdtdh="http://schemas.microsoft.com/office/word/2020/wordml/sdtdatahash" xmlns:w16se="http://schemas.microsoft.com/office/word/2015/wordml/symex" xmlns:wpg="http://schemas.microsoft.com/office/word/2010/wordprocessingGroup" xmlns:wpi="http://schemas.microsoft.com/office/word/2010/wordprocessingInk" xmlns:wne="http://schemas.microsoft.com/office/word/2006/wordml" xmlns:wps="http://schemas.microsoft.com/office/word/2010/wordprocessingShape" mc:Ignorable="w14 w15 w16se w16cid w16 w16cex w16sdtdh wp14">
   <w:endnote w:type="separator" w:id="-1">
     <w:p>
       <w:r>
@@ -2660,7 +2245,7 @@
 </file>
 
 <file path=word/footnotes.xml><?xml version="1.0" encoding="utf-8"?>
-<w:footnotes xmlns:wpc="http://schemas.microsoft.com/office/word/2010/wordprocessingCanvas" xmlns:cx="http://schemas.microsoft.com/office/drawing/2014/chartex" xmlns:cx1="http://schemas.microsoft.com/office/drawing/2015/9/8/chartex" xmlns:cx2="http://schemas.microsoft.com/office/drawing/2015/10/21/chartex" xmlns:cx3="http://schemas.microsoft.com/office/drawing/2016/5/9/chartex" xmlns:cx4="http://schemas.microsoft.com/office/drawing/2016/5/10/chartex" xmlns:cx5="http://schemas.microsoft.com/office/drawing/2016/5/11/chartex" xmlns:cx6="http://schemas.microsoft.com/office/drawing/2016/5/12/chartex" xmlns:cx7="http://schemas.microsoft.com/office/drawing/2016/5/13/chartex" xmlns:cx8="http://schemas.microsoft.com/office/drawing/2016/5/14/chartex" xmlns:mc="http://schemas.openxmlformats.org/markup-compatibility/2006" xmlns:aink="http://schemas.microsoft.com/office/drawing/2016/ink" xmlns:am3d="http://schemas.microsoft.com/office/drawing/2017/model3d" xmlns:o="urn:schemas-microsoft-com:office:office" xmlns:r="http://schemas.openxmlformats.org/officeDocument/2006/relationships" xmlns:m="http://schemas.openxmlformats.org/officeDocument/2006/math" xmlns:v="urn:schemas-microsoft-com:vml" xmlns:wp14="http://schemas.microsoft.com/office/word/2010/wordprocessingDrawing" xmlns:wp="http://schemas.openxmlformats.org/drawingml/2006/wordprocessingDrawing" xmlns:w10="urn:schemas-microsoft-com:office:word" xmlns:w="http://schemas.openxmlformats.org/wordprocessingml/2006/main" xmlns:w14="http://schemas.microsoft.com/office/word/2010/wordml" xmlns:w15="http://schemas.microsoft.com/office/word/2012/wordml" xmlns:w16cex="http://schemas.microsoft.com/office/word/2018/wordml/cex" xmlns:w16cid="http://schemas.microsoft.com/office/word/2016/wordml/cid" xmlns:w16="http://schemas.microsoft.com/office/word/2018/wordml" xmlns:w16se="http://schemas.microsoft.com/office/word/2015/wordml/symex" xmlns:wpg="http://schemas.microsoft.com/office/word/2010/wordprocessingGroup" xmlns:wpi="http://schemas.microsoft.com/office/word/2010/wordprocessingInk" xmlns:wne="http://schemas.microsoft.com/office/word/2006/wordml" xmlns:wps="http://schemas.microsoft.com/office/word/2010/wordprocessingShape" mc:Ignorable="w14 w15 w16se w16cid w16 w16cex wp14">
+<w:footnotes xmlns:wpc="http://schemas.microsoft.com/office/word/2010/wordprocessingCanvas" xmlns:cx="http://schemas.microsoft.com/office/drawing/2014/chartex" xmlns:cx1="http://schemas.microsoft.com/office/drawing/2015/9/8/chartex" xmlns:cx2="http://schemas.microsoft.com/office/drawing/2015/10/21/chartex" xmlns:cx3="http://schemas.microsoft.com/office/drawing/2016/5/9/chartex" xmlns:cx4="http://schemas.microsoft.com/office/drawing/2016/5/10/chartex" xmlns:cx5="http://schemas.microsoft.com/office/drawing/2016/5/11/chartex" xmlns:cx6="http://schemas.microsoft.com/office/drawing/2016/5/12/chartex" xmlns:cx7="http://schemas.microsoft.com/office/drawing/2016/5/13/chartex" xmlns:cx8="http://schemas.microsoft.com/office/drawing/2016/5/14/chartex" xmlns:mc="http://schemas.openxmlformats.org/markup-compatibility/2006" xmlns:aink="http://schemas.microsoft.com/office/drawing/2016/ink" xmlns:am3d="http://schemas.microsoft.com/office/drawing/2017/model3d" xmlns:o="urn:schemas-microsoft-com:office:office" xmlns:oel="http://schemas.microsoft.com/office/2019/extlst" xmlns:r="http://schemas.openxmlformats.org/officeDocument/2006/relationships" xmlns:m="http://schemas.openxmlformats.org/officeDocument/2006/math" xmlns:v="urn:schemas-microsoft-com:vml" xmlns:wp14="http://schemas.microsoft.com/office/word/2010/wordprocessingDrawing" xmlns:wp="http://schemas.openxmlformats.org/drawingml/2006/wordprocessingDrawing" xmlns:w10="urn:schemas-microsoft-com:office:word" xmlns:w="http://schemas.openxmlformats.org/wordprocessingml/2006/main" xmlns:w14="http://schemas.microsoft.com/office/word/2010/wordml" xmlns:w15="http://schemas.microsoft.com/office/word/2012/wordml" xmlns:w16cex="http://schemas.microsoft.com/office/word/2018/wordml/cex" xmlns:w16cid="http://schemas.microsoft.com/office/word/2016/wordml/cid" xmlns:w16="http://schemas.microsoft.com/office/word/2018/wordml" xmlns:w16sdtdh="http://schemas.microsoft.com/office/word/2020/wordml/sdtdatahash" xmlns:w16se="http://schemas.microsoft.com/office/word/2015/wordml/symex" xmlns:wpg="http://schemas.microsoft.com/office/word/2010/wordprocessingGroup" xmlns:wpi="http://schemas.microsoft.com/office/word/2010/wordprocessingInk" xmlns:wne="http://schemas.microsoft.com/office/word/2006/wordml" xmlns:wps="http://schemas.microsoft.com/office/word/2010/wordprocessingShape" mc:Ignorable="w14 w15 w16se w16cid w16 w16cex w16sdtdh wp14">
   <w:footnote w:type="separator" w:id="-1">
     <w:p>
       <w:r>
@@ -2679,7 +2264,7 @@
 </file>
 
 <file path=word/numbering.xml><?xml version="1.0" encoding="utf-8"?>
-<w:numbering xmlns:wpc="http://schemas.microsoft.com/office/word/2010/wordprocessingCanvas" xmlns:cx="http://schemas.microsoft.com/office/drawing/2014/chartex" xmlns:cx1="http://schemas.microsoft.com/office/drawing/2015/9/8/chartex" xmlns:cx2="http://schemas.microsoft.com/office/drawing/2015/10/21/chartex" xmlns:cx3="http://schemas.microsoft.com/office/drawing/2016/5/9/chartex" xmlns:cx4="http://schemas.microsoft.com/office/drawing/2016/5/10/chartex" xmlns:cx5="http://schemas.microsoft.com/office/drawing/2016/5/11/chartex" xmlns:cx6="http://schemas.microsoft.com/office/drawing/2016/5/12/chartex" xmlns:cx7="http://schemas.microsoft.com/office/drawing/2016/5/13/chartex" xmlns:cx8="http://schemas.microsoft.com/office/drawing/2016/5/14/chartex" xmlns:mc="http://schemas.openxmlformats.org/markup-compatibility/2006" xmlns:aink="http://schemas.microsoft.com/office/drawing/2016/ink" xmlns:am3d="http://schemas.microsoft.com/office/drawing/2017/model3d" xmlns:o="urn:schemas-microsoft-com:office:office" xmlns:r="http://schemas.openxmlformats.org/officeDocument/2006/relationships" xmlns:m="http://schemas.openxmlformats.org/officeDocument/2006/math" xmlns:v="urn:schemas-microsoft-com:vml" xmlns:wp14="http://schemas.microsoft.com/office/word/2010/wordprocessingDrawing" xmlns:wp="http://schemas.openxmlformats.org/drawingml/2006/wordprocessingDrawing" xmlns:w10="urn:schemas-microsoft-com:office:word" xmlns:w="http://schemas.openxmlformats.org/wordprocessingml/2006/main" xmlns:w14="http://schemas.microsoft.com/office/word/2010/wordml" xmlns:w15="http://schemas.microsoft.com/office/word/2012/wordml" xmlns:w16cex="http://schemas.microsoft.com/office/word/2018/wordml/cex" xmlns:w16cid="http://schemas.microsoft.com/office/word/2016/wordml/cid" xmlns:w16="http://schemas.microsoft.com/office/word/2018/wordml" xmlns:w16se="http://schemas.microsoft.com/office/word/2015/wordml/symex" xmlns:wpg="http://schemas.microsoft.com/office/word/2010/wordprocessingGroup" xmlns:wpi="http://schemas.microsoft.com/office/word/2010/wordprocessingInk" xmlns:wne="http://schemas.microsoft.com/office/word/2006/wordml" xmlns:wps="http://schemas.microsoft.com/office/word/2010/wordprocessingShape" mc:Ignorable="w14 w15 w16se w16cid w16 w16cex wp14">
+<w:numbering xmlns:wpc="http://schemas.microsoft.com/office/word/2010/wordprocessingCanvas" xmlns:cx="http://schemas.microsoft.com/office/drawing/2014/chartex" xmlns:cx1="http://schemas.microsoft.com/office/drawing/2015/9/8/chartex" xmlns:cx2="http://schemas.microsoft.com/office/drawing/2015/10/21/chartex" xmlns:cx3="http://schemas.microsoft.com/office/drawing/2016/5/9/chartex" xmlns:cx4="http://schemas.microsoft.com/office/drawing/2016/5/10/chartex" xmlns:cx5="http://schemas.microsoft.com/office/drawing/2016/5/11/chartex" xmlns:cx6="http://schemas.microsoft.com/office/drawing/2016/5/12/chartex" xmlns:cx7="http://schemas.microsoft.com/office/drawing/2016/5/13/chartex" xmlns:cx8="http://schemas.microsoft.com/office/drawing/2016/5/14/chartex" xmlns:mc="http://schemas.openxmlformats.org/markup-compatibility/2006" xmlns:aink="http://schemas.microsoft.com/office/drawing/2016/ink" xmlns:am3d="http://schemas.microsoft.com/office/drawing/2017/model3d" xmlns:o="urn:schemas-microsoft-com:office:office" xmlns:oel="http://schemas.microsoft.com/office/2019/extlst" xmlns:r="http://schemas.openxmlformats.org/officeDocument/2006/relationships" xmlns:m="http://schemas.openxmlformats.org/officeDocument/2006/math" xmlns:v="urn:schemas-microsoft-com:vml" xmlns:wp14="http://schemas.microsoft.com/office/word/2010/wordprocessingDrawing" xmlns:wp="http://schemas.openxmlformats.org/drawingml/2006/wordprocessingDrawing" xmlns:w10="urn:schemas-microsoft-com:office:word" xmlns:w="http://schemas.openxmlformats.org/wordprocessingml/2006/main" xmlns:w14="http://schemas.microsoft.com/office/word/2010/wordml" xmlns:w15="http://schemas.microsoft.com/office/word/2012/wordml" xmlns:w16cex="http://schemas.microsoft.com/office/word/2018/wordml/cex" xmlns:w16cid="http://schemas.microsoft.com/office/word/2016/wordml/cid" xmlns:w16="http://schemas.microsoft.com/office/word/2018/wordml" xmlns:w16sdtdh="http://schemas.microsoft.com/office/word/2020/wordml/sdtdatahash" xmlns:w16se="http://schemas.microsoft.com/office/word/2015/wordml/symex" xmlns:wpg="http://schemas.microsoft.com/office/word/2010/wordprocessingGroup" xmlns:wpi="http://schemas.microsoft.com/office/word/2010/wordprocessingInk" xmlns:wne="http://schemas.microsoft.com/office/word/2006/wordml" xmlns:wps="http://schemas.microsoft.com/office/word/2010/wordprocessingShape" mc:Ignorable="w14 w15 w16se w16cid w16 w16cex w16sdtdh wp14">
   <w:abstractNum w:abstractNumId="0" w15:restartNumberingAfterBreak="0">
     <w:nsid w:val="FFFFFF1D"/>
     <w:multiLevelType w:val="multilevel"/>
@@ -2934,6 +2519,119 @@
     </w:lvl>
   </w:abstractNum>
   <w:abstractNum w:abstractNumId="2" w15:restartNumberingAfterBreak="0">
+    <w:nsid w:val="218D459C"/>
+    <w:multiLevelType w:val="hybridMultilevel"/>
+    <w:tmpl w:val="1A6E3490"/>
+    <w:lvl w:ilvl="0" w:tplc="F352132E">
+      <w:start w:val="6"/>
+      <w:numFmt w:val="bullet"/>
+      <w:lvlText w:val="-"/>
+      <w:lvlJc w:val="left"/>
+      <w:pPr>
+        <w:ind w:left="612" w:hanging="360"/>
+      </w:pPr>
+      <w:rPr>
+        <w:rFonts w:ascii="Calibri" w:eastAsia="Times New Roman" w:hAnsi="Calibri" w:cs="Calibri" w:hint="default"/>
+      </w:rPr>
+    </w:lvl>
+    <w:lvl w:ilvl="1" w:tplc="04090003" w:tentative="1">
+      <w:start w:val="1"/>
+      <w:numFmt w:val="bullet"/>
+      <w:lvlText w:val="o"/>
+      <w:lvlJc w:val="left"/>
+      <w:pPr>
+        <w:ind w:left="1332" w:hanging="360"/>
+      </w:pPr>
+      <w:rPr>
+        <w:rFonts w:ascii="Courier New" w:hAnsi="Courier New" w:cs="Courier New" w:hint="default"/>
+      </w:rPr>
+    </w:lvl>
+    <w:lvl w:ilvl="2" w:tplc="04090005" w:tentative="1">
+      <w:start w:val="1"/>
+      <w:numFmt w:val="bullet"/>
+      <w:lvlText w:val=""/>
+      <w:lvlJc w:val="left"/>
+      <w:pPr>
+        <w:ind w:left="2052" w:hanging="360"/>
+      </w:pPr>
+      <w:rPr>
+        <w:rFonts w:ascii="Wingdings" w:hAnsi="Wingdings" w:hint="default"/>
+      </w:rPr>
+    </w:lvl>
+    <w:lvl w:ilvl="3" w:tplc="04090001" w:tentative="1">
+      <w:start w:val="1"/>
+      <w:numFmt w:val="bullet"/>
+      <w:lvlText w:val=""/>
+      <w:lvlJc w:val="left"/>
+      <w:pPr>
+        <w:ind w:left="2772" w:hanging="360"/>
+      </w:pPr>
+      <w:rPr>
+        <w:rFonts w:ascii="Symbol" w:hAnsi="Symbol" w:hint="default"/>
+      </w:rPr>
+    </w:lvl>
+    <w:lvl w:ilvl="4" w:tplc="04090003" w:tentative="1">
+      <w:start w:val="1"/>
+      <w:numFmt w:val="bullet"/>
+      <w:lvlText w:val="o"/>
+      <w:lvlJc w:val="left"/>
+      <w:pPr>
+        <w:ind w:left="3492" w:hanging="360"/>
+      </w:pPr>
+      <w:rPr>
+        <w:rFonts w:ascii="Courier New" w:hAnsi="Courier New" w:cs="Courier New" w:hint="default"/>
+      </w:rPr>
+    </w:lvl>
+    <w:lvl w:ilvl="5" w:tplc="04090005" w:tentative="1">
+      <w:start w:val="1"/>
+      <w:numFmt w:val="bullet"/>
+      <w:lvlText w:val=""/>
+      <w:lvlJc w:val="left"/>
+      <w:pPr>
+        <w:ind w:left="4212" w:hanging="360"/>
+      </w:pPr>
+      <w:rPr>
+        <w:rFonts w:ascii="Wingdings" w:hAnsi="Wingdings" w:hint="default"/>
+      </w:rPr>
+    </w:lvl>
+    <w:lvl w:ilvl="6" w:tplc="04090001" w:tentative="1">
+      <w:start w:val="1"/>
+      <w:numFmt w:val="bullet"/>
+      <w:lvlText w:val=""/>
+      <w:lvlJc w:val="left"/>
+      <w:pPr>
+        <w:ind w:left="4932" w:hanging="360"/>
+      </w:pPr>
+      <w:rPr>
+        <w:rFonts w:ascii="Symbol" w:hAnsi="Symbol" w:hint="default"/>
+      </w:rPr>
+    </w:lvl>
+    <w:lvl w:ilvl="7" w:tplc="04090003" w:tentative="1">
+      <w:start w:val="1"/>
+      <w:numFmt w:val="bullet"/>
+      <w:lvlText w:val="o"/>
+      <w:lvlJc w:val="left"/>
+      <w:pPr>
+        <w:ind w:left="5652" w:hanging="360"/>
+      </w:pPr>
+      <w:rPr>
+        <w:rFonts w:ascii="Courier New" w:hAnsi="Courier New" w:cs="Courier New" w:hint="default"/>
+      </w:rPr>
+    </w:lvl>
+    <w:lvl w:ilvl="8" w:tplc="04090005" w:tentative="1">
+      <w:start w:val="1"/>
+      <w:numFmt w:val="bullet"/>
+      <w:lvlText w:val=""/>
+      <w:lvlJc w:val="left"/>
+      <w:pPr>
+        <w:ind w:left="6372" w:hanging="360"/>
+      </w:pPr>
+      <w:rPr>
+        <w:rFonts w:ascii="Wingdings" w:hAnsi="Wingdings" w:hint="default"/>
+      </w:rPr>
+    </w:lvl>
+  </w:abstractNum>
+  <w:abstractNum w:abstractNumId="3" w15:restartNumberingAfterBreak="0">
     <w:nsid w:val="28C36D3A"/>
     <w:multiLevelType w:val="hybridMultilevel"/>
     <w:tmpl w:val="17462E32"/>
@@ -3076,7 +2774,7 @@
       </w:rPr>
     </w:lvl>
   </w:abstractNum>
-  <w:abstractNum w:abstractNumId="3" w15:restartNumberingAfterBreak="0">
+  <w:abstractNum w:abstractNumId="4" w15:restartNumberingAfterBreak="0">
     <w:nsid w:val="2A525042"/>
     <w:multiLevelType w:val="hybridMultilevel"/>
     <w:tmpl w:val="972E6B8C"/>
@@ -3189,7 +2887,156 @@
       </w:rPr>
     </w:lvl>
   </w:abstractNum>
-  <w:abstractNum w:abstractNumId="4" w15:restartNumberingAfterBreak="0">
+  <w:abstractNum w:abstractNumId="5" w15:restartNumberingAfterBreak="0">
+    <w:nsid w:val="37E50D79"/>
+    <w:multiLevelType w:val="multilevel"/>
+    <w:tmpl w:val="0F56C60A"/>
+    <w:lvl w:ilvl="0">
+      <w:start w:val="1"/>
+      <w:numFmt w:val="bullet"/>
+      <w:lvlText w:val=""/>
+      <w:lvlJc w:val="left"/>
+      <w:pPr>
+        <w:tabs>
+          <w:tab w:val="num" w:pos="720"/>
+        </w:tabs>
+        <w:ind w:left="720" w:hanging="360"/>
+      </w:pPr>
+      <w:rPr>
+        <w:rFonts w:ascii="Symbol" w:hAnsi="Symbol" w:hint="default"/>
+        <w:sz w:val="20"/>
+      </w:rPr>
+    </w:lvl>
+    <w:lvl w:ilvl="1" w:tentative="1">
+      <w:start w:val="1"/>
+      <w:numFmt w:val="bullet"/>
+      <w:lvlText w:val=""/>
+      <w:lvlJc w:val="left"/>
+      <w:pPr>
+        <w:tabs>
+          <w:tab w:val="num" w:pos="1440"/>
+        </w:tabs>
+        <w:ind w:left="1440" w:hanging="360"/>
+      </w:pPr>
+      <w:rPr>
+        <w:rFonts w:ascii="Symbol" w:hAnsi="Symbol" w:hint="default"/>
+        <w:sz w:val="20"/>
+      </w:rPr>
+    </w:lvl>
+    <w:lvl w:ilvl="2" w:tentative="1">
+      <w:start w:val="1"/>
+      <w:numFmt w:val="bullet"/>
+      <w:lvlText w:val=""/>
+      <w:lvlJc w:val="left"/>
+      <w:pPr>
+        <w:tabs>
+          <w:tab w:val="num" w:pos="2160"/>
+        </w:tabs>
+        <w:ind w:left="2160" w:hanging="360"/>
+      </w:pPr>
+      <w:rPr>
+        <w:rFonts w:ascii="Symbol" w:hAnsi="Symbol" w:hint="default"/>
+        <w:sz w:val="20"/>
+      </w:rPr>
+    </w:lvl>
+    <w:lvl w:ilvl="3" w:tentative="1">
+      <w:start w:val="1"/>
+      <w:numFmt w:val="bullet"/>
+      <w:lvlText w:val=""/>
+      <w:lvlJc w:val="left"/>
+      <w:pPr>
+        <w:tabs>
+          <w:tab w:val="num" w:pos="2880"/>
+        </w:tabs>
+        <w:ind w:left="2880" w:hanging="360"/>
+      </w:pPr>
+      <w:rPr>
+        <w:rFonts w:ascii="Symbol" w:hAnsi="Symbol" w:hint="default"/>
+        <w:sz w:val="20"/>
+      </w:rPr>
+    </w:lvl>
+    <w:lvl w:ilvl="4" w:tentative="1">
+      <w:start w:val="1"/>
+      <w:numFmt w:val="bullet"/>
+      <w:lvlText w:val=""/>
+      <w:lvlJc w:val="left"/>
+      <w:pPr>
+        <w:tabs>
+          <w:tab w:val="num" w:pos="3600"/>
+        </w:tabs>
+        <w:ind w:left="3600" w:hanging="360"/>
+      </w:pPr>
+      <w:rPr>
+        <w:rFonts w:ascii="Symbol" w:hAnsi="Symbol" w:hint="default"/>
+        <w:sz w:val="20"/>
+      </w:rPr>
+    </w:lvl>
+    <w:lvl w:ilvl="5" w:tentative="1">
+      <w:start w:val="1"/>
+      <w:numFmt w:val="bullet"/>
+      <w:lvlText w:val=""/>
+      <w:lvlJc w:val="left"/>
+      <w:pPr>
+        <w:tabs>
+          <w:tab w:val="num" w:pos="4320"/>
+        </w:tabs>
+        <w:ind w:left="4320" w:hanging="360"/>
+      </w:pPr>
+      <w:rPr>
+        <w:rFonts w:ascii="Symbol" w:hAnsi="Symbol" w:hint="default"/>
+        <w:sz w:val="20"/>
+      </w:rPr>
+    </w:lvl>
+    <w:lvl w:ilvl="6" w:tentative="1">
+      <w:start w:val="1"/>
+      <w:numFmt w:val="bullet"/>
+      <w:lvlText w:val=""/>
+      <w:lvlJc w:val="left"/>
+      <w:pPr>
+        <w:tabs>
+          <w:tab w:val="num" w:pos="5040"/>
+        </w:tabs>
+        <w:ind w:left="5040" w:hanging="360"/>
+      </w:pPr>
+      <w:rPr>
+        <w:rFonts w:ascii="Symbol" w:hAnsi="Symbol" w:hint="default"/>
+        <w:sz w:val="20"/>
+      </w:rPr>
+    </w:lvl>
+    <w:lvl w:ilvl="7" w:tentative="1">
+      <w:start w:val="1"/>
+      <w:numFmt w:val="bullet"/>
+      <w:lvlText w:val=""/>
+      <w:lvlJc w:val="left"/>
+      <w:pPr>
+        <w:tabs>
+          <w:tab w:val="num" w:pos="5760"/>
+        </w:tabs>
+        <w:ind w:left="5760" w:hanging="360"/>
+      </w:pPr>
+      <w:rPr>
+        <w:rFonts w:ascii="Symbol" w:hAnsi="Symbol" w:hint="default"/>
+        <w:sz w:val="20"/>
+      </w:rPr>
+    </w:lvl>
+    <w:lvl w:ilvl="8" w:tentative="1">
+      <w:start w:val="1"/>
+      <w:numFmt w:val="bullet"/>
+      <w:lvlText w:val=""/>
+      <w:lvlJc w:val="left"/>
+      <w:pPr>
+        <w:tabs>
+          <w:tab w:val="num" w:pos="6480"/>
+        </w:tabs>
+        <w:ind w:left="6480" w:hanging="360"/>
+      </w:pPr>
+      <w:rPr>
+        <w:rFonts w:ascii="Symbol" w:hAnsi="Symbol" w:hint="default"/>
+        <w:sz w:val="20"/>
+      </w:rPr>
+    </w:lvl>
+  </w:abstractNum>
+  <w:abstractNum w:abstractNumId="6" w15:restartNumberingAfterBreak="0">
     <w:nsid w:val="43EE3875"/>
     <w:multiLevelType w:val="hybridMultilevel"/>
     <w:tmpl w:val="1F2409AA"/>
@@ -3332,7 +3179,7 @@
       </w:rPr>
     </w:lvl>
   </w:abstractNum>
-  <w:abstractNum w:abstractNumId="5" w15:restartNumberingAfterBreak="0">
+  <w:abstractNum w:abstractNumId="7" w15:restartNumberingAfterBreak="0">
     <w:nsid w:val="44E36D24"/>
     <w:multiLevelType w:val="multilevel"/>
     <w:tmpl w:val="C574A1D4"/>
@@ -3475,7 +3322,7 @@
       </w:rPr>
     </w:lvl>
   </w:abstractNum>
-  <w:abstractNum w:abstractNumId="6" w15:restartNumberingAfterBreak="0">
+  <w:abstractNum w:abstractNumId="8" w15:restartNumberingAfterBreak="0">
     <w:nsid w:val="4EA55D92"/>
     <w:multiLevelType w:val="hybridMultilevel"/>
     <w:tmpl w:val="40F8EF08"/>
@@ -3619,7 +3466,120 @@
       </w:rPr>
     </w:lvl>
   </w:abstractNum>
-  <w:abstractNum w:abstractNumId="7" w15:restartNumberingAfterBreak="0">
+  <w:abstractNum w:abstractNumId="9" w15:restartNumberingAfterBreak="0">
+    <w:nsid w:val="59D62AF9"/>
+    <w:multiLevelType w:val="hybridMultilevel"/>
+    <w:tmpl w:val="B0DC66D8"/>
+    <w:lvl w:ilvl="0" w:tplc="D10E9AFE">
+      <w:start w:val="6"/>
+      <w:numFmt w:val="bullet"/>
+      <w:lvlText w:val="-"/>
+      <w:lvlJc w:val="left"/>
+      <w:pPr>
+        <w:ind w:left="720" w:hanging="360"/>
+      </w:pPr>
+      <w:rPr>
+        <w:rFonts w:ascii="Calibri" w:eastAsia="Times New Roman" w:hAnsi="Calibri" w:cs="Calibri" w:hint="default"/>
+      </w:rPr>
+    </w:lvl>
+    <w:lvl w:ilvl="1" w:tplc="04090003" w:tentative="1">
+      <w:start w:val="1"/>
+      <w:numFmt w:val="bullet"/>
+      <w:lvlText w:val="o"/>
+      <w:lvlJc w:val="left"/>
+      <w:pPr>
+        <w:ind w:left="1440" w:hanging="360"/>
+      </w:pPr>
+      <w:rPr>
+        <w:rFonts w:ascii="Courier New" w:hAnsi="Courier New" w:cs="Courier New" w:hint="default"/>
+      </w:rPr>
+    </w:lvl>
+    <w:lvl w:ilvl="2" w:tplc="04090005" w:tentative="1">
+      <w:start w:val="1"/>
+      <w:numFmt w:val="bullet"/>
+      <w:lvlText w:val=""/>
+      <w:lvlJc w:val="left"/>
+      <w:pPr>
+        <w:ind w:left="2160" w:hanging="360"/>
+      </w:pPr>
+      <w:rPr>
+        <w:rFonts w:ascii="Wingdings" w:hAnsi="Wingdings" w:hint="default"/>
+      </w:rPr>
+    </w:lvl>
+    <w:lvl w:ilvl="3" w:tplc="04090001" w:tentative="1">
+      <w:start w:val="1"/>
+      <w:numFmt w:val="bullet"/>
+      <w:lvlText w:val=""/>
+      <w:lvlJc w:val="left"/>
+      <w:pPr>
+        <w:ind w:left="2880" w:hanging="360"/>
+      </w:pPr>
+      <w:rPr>
+        <w:rFonts w:ascii="Symbol" w:hAnsi="Symbol" w:hint="default"/>
+      </w:rPr>
+    </w:lvl>
+    <w:lvl w:ilvl="4" w:tplc="04090003" w:tentative="1">
+      <w:start w:val="1"/>
+      <w:numFmt w:val="bullet"/>
+      <w:lvlText w:val="o"/>
+      <w:lvlJc w:val="left"/>
+      <w:pPr>
+        <w:ind w:left="3600" w:hanging="360"/>
+      </w:pPr>
+      <w:rPr>
+        <w:rFonts w:ascii="Courier New" w:hAnsi="Courier New" w:cs="Courier New" w:hint="default"/>
+      </w:rPr>
+    </w:lvl>
+    <w:lvl w:ilvl="5" w:tplc="04090005" w:tentative="1">
+      <w:start w:val="1"/>
+      <w:numFmt w:val="bullet"/>
+      <w:lvlText w:val=""/>
+      <w:lvlJc w:val="left"/>
+      <w:pPr>
+        <w:ind w:left="4320" w:hanging="360"/>
+      </w:pPr>
+      <w:rPr>
+        <w:rFonts w:ascii="Wingdings" w:hAnsi="Wingdings" w:hint="default"/>
+      </w:rPr>
+    </w:lvl>
+    <w:lvl w:ilvl="6" w:tplc="04090001" w:tentative="1">
+      <w:start w:val="1"/>
+      <w:numFmt w:val="bullet"/>
+      <w:lvlText w:val=""/>
+      <w:lvlJc w:val="left"/>
+      <w:pPr>
+        <w:ind w:left="5040" w:hanging="360"/>
+      </w:pPr>
+      <w:rPr>
+        <w:rFonts w:ascii="Symbol" w:hAnsi="Symbol" w:hint="default"/>
+      </w:rPr>
+    </w:lvl>
+    <w:lvl w:ilvl="7" w:tplc="04090003" w:tentative="1">
+      <w:start w:val="1"/>
+      <w:numFmt w:val="bullet"/>
+      <w:lvlText w:val="o"/>
+      <w:lvlJc w:val="left"/>
+      <w:pPr>
+        <w:ind w:left="5760" w:hanging="360"/>
+      </w:pPr>
+      <w:rPr>
+        <w:rFonts w:ascii="Courier New" w:hAnsi="Courier New" w:cs="Courier New" w:hint="default"/>
+      </w:rPr>
+    </w:lvl>
+    <w:lvl w:ilvl="8" w:tplc="04090005" w:tentative="1">
+      <w:start w:val="1"/>
+      <w:numFmt w:val="bullet"/>
+      <w:lvlText w:val=""/>
+      <w:lvlJc w:val="left"/>
+      <w:pPr>
+        <w:ind w:left="6480" w:hanging="360"/>
+      </w:pPr>
+      <w:rPr>
+        <w:rFonts w:ascii="Wingdings" w:hAnsi="Wingdings" w:hint="default"/>
+      </w:rPr>
+    </w:lvl>
+  </w:abstractNum>
+  <w:abstractNum w:abstractNumId="10" w15:restartNumberingAfterBreak="0">
     <w:nsid w:val="602376DE"/>
     <w:multiLevelType w:val="multilevel"/>
     <w:tmpl w:val="1F2409AA"/>
@@ -3762,7 +3722,7 @@
       </w:rPr>
     </w:lvl>
   </w:abstractNum>
-  <w:abstractNum w:abstractNumId="8" w15:restartNumberingAfterBreak="0">
+  <w:abstractNum w:abstractNumId="11" w15:restartNumberingAfterBreak="0">
     <w:nsid w:val="664F2126"/>
     <w:multiLevelType w:val="hybridMultilevel"/>
     <w:tmpl w:val="DE1EB572"/>
@@ -3875,7 +3835,7 @@
       </w:rPr>
     </w:lvl>
   </w:abstractNum>
-  <w:abstractNum w:abstractNumId="9" w15:restartNumberingAfterBreak="0">
+  <w:abstractNum w:abstractNumId="12" w15:restartNumberingAfterBreak="0">
     <w:nsid w:val="66BE4B9C"/>
     <w:multiLevelType w:val="hybridMultilevel"/>
     <w:tmpl w:val="C574A1D4"/>
@@ -4018,7 +3978,7 @@
       </w:rPr>
     </w:lvl>
   </w:abstractNum>
-  <w:abstractNum w:abstractNumId="10" w15:restartNumberingAfterBreak="0">
+  <w:abstractNum w:abstractNumId="13" w15:restartNumberingAfterBreak="0">
     <w:nsid w:val="6C8E594D"/>
     <w:multiLevelType w:val="hybridMultilevel"/>
     <w:tmpl w:val="4FF2909A"/>
@@ -4161,7 +4121,7 @@
       </w:rPr>
     </w:lvl>
   </w:abstractNum>
-  <w:abstractNum w:abstractNumId="11" w15:restartNumberingAfterBreak="0">
+  <w:abstractNum w:abstractNumId="14" w15:restartNumberingAfterBreak="0">
     <w:nsid w:val="73054A62"/>
     <w:multiLevelType w:val="hybridMultilevel"/>
     <w:tmpl w:val="ABB00A48"/>
@@ -4301,7 +4261,7 @@
       </w:rPr>
     </w:lvl>
   </w:abstractNum>
-  <w:abstractNum w:abstractNumId="12" w15:restartNumberingAfterBreak="0">
+  <w:abstractNum w:abstractNumId="15" w15:restartNumberingAfterBreak="0">
     <w:nsid w:val="7D8828E0"/>
     <w:multiLevelType w:val="hybridMultilevel"/>
     <w:tmpl w:val="B68CC4E6"/>
@@ -4444,50 +4404,59 @@
       </w:rPr>
     </w:lvl>
   </w:abstractNum>
-  <w:num w:numId="1">
+  <w:num w:numId="1" w16cid:durableId="174345982">
+    <w:abstractNumId w:val="6"/>
+  </w:num>
+  <w:num w:numId="2" w16cid:durableId="576591569">
+    <w:abstractNumId w:val="3"/>
+  </w:num>
+  <w:num w:numId="3" w16cid:durableId="1964455288">
+    <w:abstractNumId w:val="8"/>
+  </w:num>
+  <w:num w:numId="4" w16cid:durableId="1809740008">
+    <w:abstractNumId w:val="15"/>
+  </w:num>
+  <w:num w:numId="5" w16cid:durableId="1663850123">
+    <w:abstractNumId w:val="12"/>
+  </w:num>
+  <w:num w:numId="6" w16cid:durableId="1726873998">
+    <w:abstractNumId w:val="14"/>
+  </w:num>
+  <w:num w:numId="7" w16cid:durableId="1737628104">
+    <w:abstractNumId w:val="13"/>
+  </w:num>
+  <w:num w:numId="8" w16cid:durableId="824591776">
+    <w:abstractNumId w:val="10"/>
+  </w:num>
+  <w:num w:numId="9" w16cid:durableId="1081562466">
+    <w:abstractNumId w:val="7"/>
+  </w:num>
+  <w:num w:numId="10" w16cid:durableId="666596524">
+    <w:abstractNumId w:val="0"/>
+  </w:num>
+  <w:num w:numId="11" w16cid:durableId="910847414">
+    <w:abstractNumId w:val="11"/>
+  </w:num>
+  <w:num w:numId="12" w16cid:durableId="1205286574">
     <w:abstractNumId w:val="4"/>
   </w:num>
-  <w:num w:numId="2">
+  <w:num w:numId="13" w16cid:durableId="469830577">
+    <w:abstractNumId w:val="1"/>
+  </w:num>
+  <w:num w:numId="14" w16cid:durableId="219052901">
+    <w:abstractNumId w:val="5"/>
+  </w:num>
+  <w:num w:numId="15" w16cid:durableId="942687552">
     <w:abstractNumId w:val="2"/>
   </w:num>
-  <w:num w:numId="3">
-    <w:abstractNumId w:val="6"/>
-  </w:num>
-  <w:num w:numId="4">
-    <w:abstractNumId w:val="12"/>
-  </w:num>
-  <w:num w:numId="5">
+  <w:num w:numId="16" w16cid:durableId="329216700">
     <w:abstractNumId w:val="9"/>
-  </w:num>
-  <w:num w:numId="6">
-    <w:abstractNumId w:val="11"/>
-  </w:num>
-  <w:num w:numId="7">
-    <w:abstractNumId w:val="10"/>
-  </w:num>
-  <w:num w:numId="8">
-    <w:abstractNumId w:val="7"/>
-  </w:num>
-  <w:num w:numId="9">
-    <w:abstractNumId w:val="5"/>
-  </w:num>
-  <w:num w:numId="10">
-    <w:abstractNumId w:val="0"/>
-  </w:num>
-  <w:num w:numId="11">
-    <w:abstractNumId w:val="8"/>
-  </w:num>
-  <w:num w:numId="12">
-    <w:abstractNumId w:val="3"/>
-  </w:num>
-  <w:num w:numId="13">
-    <w:abstractNumId w:val="1"/>
   </w:num>
 </w:numbering>
 </file>
 
 <file path=word/styles.xml><?xml version="1.0" encoding="utf-8"?>
-<w:styles xmlns:mc="http://schemas.openxmlformats.org/markup-compatibility/2006" xmlns:r="http://schemas.openxmlformats.org/officeDocument/2006/relationships" xmlns:w="http://schemas.openxmlformats.org/wordprocessingml/2006/main" xmlns:w14="http://schemas.microsoft.com/office/word/2010/wordml" xmlns:w15="http://schemas.microsoft.com/office/word/2012/wordml" xmlns:w16cex="http://schemas.microsoft.com/office/word/2018/wordml/cex" xmlns:w16cid="http://schemas.microsoft.com/office/word/2016/wordml/cid" xmlns:w16="http://schemas.microsoft.com/office/word/2018/wordml" xmlns:w16se="http://schemas.microsoft.com/office/word/2015/wordml/symex" mc:Ignorable="w14 w15 w16se w16cid w16 w16cex">
+<w:styles xmlns:mc="http://schemas.openxmlformats.org/markup-compatibility/2006" xmlns:r="http://schemas.openxmlformats.org/officeDocument/2006/relationships" xmlns:w="http://schemas.openxmlformats.org/wordprocessingml/2006/main" xmlns:w14="http://schemas.microsoft.com/office/word/2010/wordml" xmlns:w15="http://schemas.microsoft.com/office/word/2012/wordml" xmlns:w16cex="http://schemas.microsoft.com/office/word/2018/wordml/cex" xmlns:w16cid="http://schemas.microsoft.com/office/word/2016/wordml/cid" xmlns:w16="http://schemas.microsoft.com/office/word/2018/wordml" xmlns:w16sdtdh="http://schemas.microsoft.com/office/word/2020/wordml/sdtdatahash" xmlns:w16se="http://schemas.microsoft.com/office/word/2015/wordml/symex" mc:Ignorable="w14 w15 w16se w16cid w16 w16cex w16sdtdh">
   <w:docDefaults>
     <w:rPrDefault>
       <w:rPr>
@@ -4781,7 +4750,7 @@
   <w:style w:type="paragraph" w:default="1" w:styleId="Normal">
     <w:name w:val="Normal"/>
     <w:qFormat/>
-    <w:rsid w:val="00CC5C53"/>
+    <w:rsid w:val="00D2779A"/>
     <w:rPr>
       <w:sz w:val="24"/>
       <w:szCs w:val="24"/>
@@ -4900,7 +4869,6 @@
   <w:style w:type="character" w:default="1" w:styleId="DefaultParagraphFont">
     <w:name w:val="Default Paragraph Font"/>
     <w:uiPriority w:val="1"/>
-    <w:semiHidden/>
     <w:unhideWhenUsed/>
   </w:style>
   <w:style w:type="table" w:default="1" w:styleId="TableNormal">
@@ -5100,6 +5068,11 @@
       <w:i/>
       <w:iCs/>
     </w:rPr>
+  </w:style>
+  <w:style w:type="paragraph" w:styleId="NormalWeb">
+    <w:name w:val="Normal (Web)"/>
+    <w:basedOn w:val="Normal"/>
+    <w:rsid w:val="00D0122D"/>
   </w:style>
 </w:styles>
 </file>

</xml_diff>

<commit_message>
Remove 50KSLOC from bullet
</commit_message>
<xml_diff>
--- a/resume.docx
+++ b/resume.docx
@@ -428,7 +428,23 @@
                 <w:sz w:val="20"/>
                 <w:szCs w:val="20"/>
               </w:rPr>
-              <w:t>Designed and developed the CI/CD pipeline for the application with over 50 KSLOC using Jenkins and XLR, in addition</w:t>
+              <w:t>Designed and developed the CI/CD pipeline for the application</w:t>
+            </w:r>
+            <w:r>
+              <w:rPr>
+                <w:rFonts w:ascii="Calibri" w:hAnsi="Calibri" w:cs="Calibri"/>
+                <w:sz w:val="20"/>
+                <w:szCs w:val="20"/>
+              </w:rPr>
+              <w:t xml:space="preserve"> </w:t>
+            </w:r>
+            <w:r>
+              <w:rPr>
+                <w:rFonts w:ascii="Calibri" w:hAnsi="Calibri" w:cs="Calibri"/>
+                <w:sz w:val="20"/>
+                <w:szCs w:val="20"/>
+              </w:rPr>
+              <w:t>using Jenkins and XLR, in addition</w:t>
             </w:r>
             <w:r>
               <w:rPr>

</xml_diff>